<commit_message>
feat: add scoring, calibration and explanations for unmatched items
- Text similarity written on the standard library, handling bank abbreviations that drop vowels
- Five scoring features with per-candidate contributions stored for the reviewer
- Candidate generation with meet-in-the-middle group search across the whole date window
- Weighted scoring with deterministic ranking and an ambiguity margin
- Explanations with eight conflict detectors; conflicting evidence is never omitted
- Isotonic calibration fitted on the July dataset only, clamped away from certainty
- Matching service runs rules first, then scoring; --rules-only reproduces the Stage 6 baseline
- Hybrid benchmark: precision 1.0000 unchanged, recall 0.6866 to 0.9789, 443 to 85 items left for review
- DOC-05 revised: SQLAlchemy and RapidFuzz replaced by the standard library, ADR-16 to ADR-20 added
- 95 tests, up from 63
</commit_message>
<xml_diff>
--- a/docs/word-files/05_system_design.docx
+++ b/docs/word-files/05_system_design.docx
@@ -1054,31 +1054,7 @@
               <w:jc w:val="left"/>
             </w:pPr>
             <w:r>
-              <w:t xml:space="preserve">SQLAlchemy Core</w:t>
-            </w:r>
-          </w:p>
-        </w:tc>
-        <w:tc>
-          <w:tcPr/>
-          <w:p>
-            <w:pPr>
-              <w:pStyle w:val="Compact"/>
-              <w:jc w:val="left"/>
-            </w:pPr>
-            <w:r>
-              <w:t xml:space="preserve">Database access</w:t>
-            </w:r>
-          </w:p>
-        </w:tc>
-        <w:tc>
-          <w:tcPr/>
-          <w:p>
-            <w:pPr>
-              <w:pStyle w:val="Compact"/>
-              <w:jc w:val="left"/>
-            </w:pPr>
-            <w:r>
-              <w:t xml:space="preserve">Parameterized statements and table reflection from</w:t>
+              <w:t xml:space="preserve">Standard library</w:t>
             </w:r>
             <w:r>
               <w:t xml:space="preserve"> </w:t>
@@ -1087,10 +1063,46 @@
               <w:rPr>
                 <w:rStyle w:val="VerbatimChar"/>
               </w:rPr>
-              <w:t xml:space="preserve">schema.sql</w:t>
-            </w:r>
-            <w:r>
-              <w:t xml:space="preserve">. The ORM is not used: it would restate table definitions already held in the schema, and the schema is the source of truth</w:t>
+              <w:t xml:space="preserve">sqlite3</w:t>
+            </w:r>
+          </w:p>
+        </w:tc>
+        <w:tc>
+          <w:tcPr/>
+          <w:p>
+            <w:pPr>
+              <w:pStyle w:val="Compact"/>
+              <w:jc w:val="left"/>
+            </w:pPr>
+            <w:r>
+              <w:t xml:space="preserve">Database access</w:t>
+            </w:r>
+          </w:p>
+        </w:tc>
+        <w:tc>
+          <w:tcPr/>
+          <w:p>
+            <w:pPr>
+              <w:pStyle w:val="Compact"/>
+              <w:jc w:val="left"/>
+            </w:pPr>
+            <w:r>
+              <w:t xml:space="preserve">The schema is the source of truth and repositories write explicit SQL, so an abstraction layer would wrap</w:t>
+            </w:r>
+            <w:r>
+              <w:t xml:space="preserve"> </w:t>
+            </w:r>
+            <w:r>
+              <w:rPr>
+                <w:rStyle w:val="VerbatimChar"/>
+              </w:rPr>
+              <w:t xml:space="preserve">sqlite3</w:t>
+            </w:r>
+            <w:r>
+              <w:t xml:space="preserve"> </w:t>
+            </w:r>
+            <w:r>
+              <w:t xml:space="preserve">without replacing anything. Parameterized statements, transactions and row factories are all native (revised in Stage 6; see ADR-01)</w:t>
             </w:r>
           </w:p>
         </w:tc>
@@ -1142,7 +1154,10 @@
               <w:jc w:val="left"/>
             </w:pPr>
             <w:r>
-              <w:t xml:space="preserve">RapidFuzz</w:t>
+              <w:rPr>
+                <w:rStyle w:val="VerbatimChar"/>
+              </w:rPr>
+              <w:t xml:space="preserve">app/domain/text.py</w:t>
             </w:r>
           </w:p>
         </w:tc>
@@ -1166,7 +1181,7 @@
               <w:jc w:val="left"/>
             </w:pPr>
             <w:r>
-              <w:t xml:space="preserve">Fast, dependency-free token-set ratio. Python’s</w:t>
+              <w:t xml:space="preserve">One token-set function written on</w:t>
             </w:r>
             <w:r>
               <w:t xml:space="preserve"> </w:t>
@@ -1178,10 +1193,7 @@
               <w:t xml:space="preserve">difflib</w:t>
             </w:r>
             <w:r>
-              <w:t xml:space="preserve"> </w:t>
-            </w:r>
-            <w:r>
-              <w:t xml:space="preserve">is slower and handles reordered words poorly, which matters for abbreviated payee names</w:t>
+              <w:t xml:space="preserve">, about forty lines. A dependency for a single function is hard to justify, and bank abbreviations that drop vowels (SLVR for SILVER) need a subsequence test that off-the-shelf ratios handle poorly (revised in Stage 6)</w:t>
             </w:r>
           </w:p>
         </w:tc>
@@ -1268,7 +1280,7 @@
         <w:pStyle w:val="BodyText"/>
       </w:pPr>
       <w:r>
-        <w:t xml:space="preserve">Deliberately not used: an ORM, a task queue, Docker, a front-end framework, a cloud service, or any paid API.</w:t>
+        <w:t xml:space="preserve">Deliberately not used: an ORM, a migrations framework, a task queue, Docker, a front-end framework, a cloud service, or any paid API. Stages 6 and 7 run on the standard library plus scikit-learn; the first third-party import happens in the web layer.</w:t>
       </w:r>
     </w:p>
     <w:bookmarkEnd w:id="26"/>
@@ -1348,7 +1360,7 @@
               <w:t xml:space="preserve">db/schema.sql</w:t>
             </w:r>
             <w:r>
-              <w:t xml:space="preserve">. On startup the engine executes it if the database is empty, then reflects the tables</w:t>
+              <w:t xml:space="preserve">. On startup the connection executes it if the database is empty</w:t>
             </w:r>
           </w:p>
         </w:tc>
@@ -1374,7 +1386,7 @@
               <w:jc w:val="left"/>
             </w:pPr>
             <w:r>
-              <w:t xml:space="preserve">SQLAlchemy Core with bound parameters only; no string-built SQL anywhere</w:t>
+              <w:t xml:space="preserve">Bound parameters only; table and column names come from repository code, never from input; no string-built SQL anywhere</w:t>
             </w:r>
           </w:p>
         </w:tc>
@@ -7471,31 +7483,55 @@
               <w:jc w:val="left"/>
             </w:pPr>
             <w:r>
-              <w:t xml:space="preserve">Schema in SQL, not in ORM models</w:t>
-            </w:r>
-          </w:p>
-        </w:tc>
-        <w:tc>
-          <w:tcPr/>
-          <w:p>
-            <w:pPr>
-              <w:pStyle w:val="Compact"/>
-              <w:jc w:val="left"/>
-            </w:pPr>
-            <w:r>
-              <w:t xml:space="preserve">Constraints and triggers are the control layer; restating them in Python would create two sources of truth</w:t>
-            </w:r>
-          </w:p>
-        </w:tc>
-        <w:tc>
-          <w:tcPr/>
-          <w:p>
-            <w:pPr>
-              <w:pStyle w:val="Compact"/>
-              <w:jc w:val="left"/>
-            </w:pPr>
-            <w:r>
-              <w:t xml:space="preserve">SQLAlchemy Core with reflection; no migrations framework</w:t>
+              <w:t xml:space="preserve">Schema in SQL, accessed through the standard library</w:t>
+            </w:r>
+          </w:p>
+        </w:tc>
+        <w:tc>
+          <w:tcPr/>
+          <w:p>
+            <w:pPr>
+              <w:pStyle w:val="Compact"/>
+              <w:jc w:val="left"/>
+            </w:pPr>
+            <w:r>
+              <w:t xml:space="preserve">Constraints and triggers are the control layer; restating them in Python would create two sources of truth. With no ORM and no migrations, SQLAlchemy would wrap</w:t>
+            </w:r>
+            <w:r>
+              <w:t xml:space="preserve"> </w:t>
+            </w:r>
+            <w:r>
+              <w:rPr>
+                <w:rStyle w:val="VerbatimChar"/>
+              </w:rPr>
+              <w:t xml:space="preserve">sqlite3</w:t>
+            </w:r>
+            <w:r>
+              <w:t xml:space="preserve"> </w:t>
+            </w:r>
+            <w:r>
+              <w:t xml:space="preserve">rather than replace it (revised in Stage 6)</w:t>
+            </w:r>
+          </w:p>
+        </w:tc>
+        <w:tc>
+          <w:tcPr/>
+          <w:p>
+            <w:pPr>
+              <w:pStyle w:val="Compact"/>
+              <w:jc w:val="left"/>
+            </w:pPr>
+            <w:r>
+              <w:rPr>
+                <w:rStyle w:val="VerbatimChar"/>
+              </w:rPr>
+              <w:t xml:space="preserve">sqlite3</w:t>
+            </w:r>
+            <w:r>
+              <w:t xml:space="preserve"> </w:t>
+            </w:r>
+            <w:r>
+              <w:t xml:space="preserve">with explicit SQL in repositories; no migrations framework</w:t>
             </w:r>
           </w:p>
         </w:tc>
@@ -8205,6 +8241,274 @@
             </w:pPr>
             <w:r>
               <w:t xml:space="preserve">Extra timing events in the audit log</w:t>
+            </w:r>
+          </w:p>
+        </w:tc>
+      </w:tr>
+      <w:tr>
+        <w:tc>
+          <w:tcPr/>
+          <w:p>
+            <w:pPr>
+              <w:pStyle w:val="Compact"/>
+              <w:jc w:val="left"/>
+            </w:pPr>
+            <w:r>
+              <w:t xml:space="preserve">ADR-16</w:t>
+            </w:r>
+          </w:p>
+        </w:tc>
+        <w:tc>
+          <w:tcPr/>
+          <w:p>
+            <w:pPr>
+              <w:pStyle w:val="Compact"/>
+              <w:jc w:val="left"/>
+            </w:pPr>
+            <w:r>
+              <w:t xml:space="preserve">Text similarity written in the project, not imported</w:t>
+            </w:r>
+          </w:p>
+        </w:tc>
+        <w:tc>
+          <w:tcPr/>
+          <w:p>
+            <w:pPr>
+              <w:pStyle w:val="Compact"/>
+              <w:jc w:val="left"/>
+            </w:pPr>
+            <w:r>
+              <w:t xml:space="preserve">One function, and the abbreviation case needs a subsequence test; a reviewer asking why two names scored 0.94 can read the answer</w:t>
+            </w:r>
+          </w:p>
+        </w:tc>
+        <w:tc>
+          <w:tcPr/>
+          <w:p>
+            <w:pPr>
+              <w:pStyle w:val="Compact"/>
+              <w:jc w:val="left"/>
+            </w:pPr>
+            <w:r>
+              <w:t xml:space="preserve">Forty lines to maintain, and no library to upgrade</w:t>
+            </w:r>
+          </w:p>
+        </w:tc>
+      </w:tr>
+      <w:tr>
+        <w:tc>
+          <w:tcPr/>
+          <w:p>
+            <w:pPr>
+              <w:pStyle w:val="Compact"/>
+              <w:jc w:val="left"/>
+            </w:pPr>
+            <w:r>
+              <w:t xml:space="preserve">ADR-17</w:t>
+            </w:r>
+          </w:p>
+        </w:tc>
+        <w:tc>
+          <w:tcPr/>
+          <w:p>
+            <w:pPr>
+              <w:pStyle w:val="Compact"/>
+              <w:jc w:val="left"/>
+            </w:pPr>
+            <w:r>
+              <w:t xml:space="preserve">Group search by meet in the middle</w:t>
+            </w:r>
+          </w:p>
+        </w:tc>
+        <w:tc>
+          <w:tcPr/>
+          <w:p>
+            <w:pPr>
+              <w:pStyle w:val="Compact"/>
+              <w:jc w:val="left"/>
+            </w:pPr>
+            <w:r>
+              <w:t xml:space="preserve">Keeping only the largest candidates is the wrong slice: a deposit made of four mid-sized receipts would never be found. Indexing subset sums searches the whole window in quadratic time</w:t>
+            </w:r>
+          </w:p>
+        </w:tc>
+        <w:tc>
+          <w:tcPr/>
+          <w:p>
+            <w:pPr>
+              <w:pStyle w:val="Compact"/>
+              <w:jc w:val="left"/>
+            </w:pPr>
+            <w:r>
+              <w:t xml:space="preserve">Groups of five or more members remain out of reach, and that limit is reported as EXC-08</w:t>
+            </w:r>
+          </w:p>
+        </w:tc>
+      </w:tr>
+      <w:tr>
+        <w:tc>
+          <w:tcPr/>
+          <w:p>
+            <w:pPr>
+              <w:pStyle w:val="Compact"/>
+              <w:jc w:val="left"/>
+            </w:pPr>
+            <w:r>
+              <w:t xml:space="preserve">ADR-18</w:t>
+            </w:r>
+          </w:p>
+        </w:tc>
+        <w:tc>
+          <w:tcPr/>
+          <w:p>
+            <w:pPr>
+              <w:pStyle w:val="Compact"/>
+              <w:jc w:val="left"/>
+            </w:pPr>
+            <w:r>
+              <w:t xml:space="preserve">Confidence clamped to [0.02, 0.98]</w:t>
+            </w:r>
+          </w:p>
+        </w:tc>
+        <w:tc>
+          <w:tcPr/>
+          <w:p>
+            <w:pPr>
+              <w:pStyle w:val="Compact"/>
+              <w:jc w:val="left"/>
+            </w:pPr>
+            <w:r>
+              <w:t xml:space="preserve">A finite sample cannot establish certainty, and an interface showing</w:t>
+            </w:r>
+            <w:r>
+              <w:t xml:space="preserve"> </w:t>
+            </w:r>
+            <w:r>
+              <w:t xml:space="preserve">“</w:t>
+            </w:r>
+            <w:r>
+              <w:t xml:space="preserve">100% confident</w:t>
+            </w:r>
+            <w:r>
+              <w:t xml:space="preserve">”</w:t>
+            </w:r>
+            <w:r>
+              <w:t xml:space="preserve"> </w:t>
+            </w:r>
+            <w:r>
+              <w:t xml:space="preserve">invites the over-trust the control design exists to prevent</w:t>
+            </w:r>
+          </w:p>
+        </w:tc>
+        <w:tc>
+          <w:tcPr/>
+          <w:p>
+            <w:pPr>
+              <w:pStyle w:val="Compact"/>
+              <w:jc w:val="left"/>
+            </w:pPr>
+            <w:r>
+              <w:t xml:space="preserve">No recommendation can ever display as certain</w:t>
+            </w:r>
+          </w:p>
+        </w:tc>
+      </w:tr>
+      <w:tr>
+        <w:tc>
+          <w:tcPr/>
+          <w:p>
+            <w:pPr>
+              <w:pStyle w:val="Compact"/>
+              <w:jc w:val="left"/>
+            </w:pPr>
+            <w:r>
+              <w:t xml:space="preserve">ADR-19</w:t>
+            </w:r>
+          </w:p>
+        </w:tc>
+        <w:tc>
+          <w:tcPr/>
+          <w:p>
+            <w:pPr>
+              <w:pStyle w:val="Compact"/>
+              <w:jc w:val="left"/>
+            </w:pPr>
+            <w:r>
+              <w:t xml:space="preserve">Hard negatives added when fitting calibration</w:t>
+            </w:r>
+          </w:p>
+        </w:tc>
+        <w:tc>
+          <w:tcPr/>
+          <w:p>
+            <w:pPr>
+              <w:pStyle w:val="Compact"/>
+              <w:jc w:val="left"/>
+            </w:pPr>
+            <w:r>
+              <w:t xml:space="preserve">Candidate generation is narrow, so its output alone is almost all correct and teaches a calibrator nothing about the middle of the range</w:t>
+            </w:r>
+          </w:p>
+        </w:tc>
+        <w:tc>
+          <w:tcPr/>
+          <w:p>
+            <w:pPr>
+              <w:pStyle w:val="Compact"/>
+              <w:jc w:val="left"/>
+            </w:pPr>
+            <w:r>
+              <w:t xml:space="preserve">The fitting set is not the production distribution, which is recorded in the artefact notes</w:t>
+            </w:r>
+          </w:p>
+        </w:tc>
+      </w:tr>
+      <w:tr>
+        <w:tc>
+          <w:tcPr/>
+          <w:p>
+            <w:pPr>
+              <w:pStyle w:val="Compact"/>
+              <w:jc w:val="left"/>
+            </w:pPr>
+            <w:r>
+              <w:t xml:space="preserve">ADR-20</w:t>
+            </w:r>
+          </w:p>
+        </w:tc>
+        <w:tc>
+          <w:tcPr/>
+          <w:p>
+            <w:pPr>
+              <w:pStyle w:val="Compact"/>
+              <w:jc w:val="left"/>
+            </w:pPr>
+            <w:r>
+              <w:t xml:space="preserve">A missing calibration artefact is not an error</w:t>
+            </w:r>
+          </w:p>
+        </w:tc>
+        <w:tc>
+          <w:tcPr/>
+          <w:p>
+            <w:pPr>
+              <w:pStyle w:val="Compact"/>
+              <w:jc w:val="left"/>
+            </w:pPr>
+            <w:r>
+              <w:t xml:space="preserve">A run proceeds and labels itself uncalibrated, so no report can present an unfitted score as a calibrated confidence</w:t>
+            </w:r>
+          </w:p>
+        </w:tc>
+        <w:tc>
+          <w:tcPr/>
+          <w:p>
+            <w:pPr>
+              <w:pStyle w:val="Compact"/>
+              <w:jc w:val="left"/>
+            </w:pPr>
+            <w:r>
+              <w:t xml:space="preserve">Two possible states to handle in reports</w:t>
             </w:r>
           </w:p>
         </w:tc>

</xml_diff>

<commit_message>
feat(controls): add review controls, reporting, period close and reviewer interface
Control layer for permissions, separation of duties, state models, period lock and the six-condition rule. Review, adjustment, period, report, run and prose services with BLOCKED_ATTEMPT evidence. Manual pairing, bank-to-book statement, 13-report package with content hashes and report check. FastAPI reviewer interface for screens W1 to W8. CLI report and serve. DOC-05 revised, DOC-06 added. 224 tests passing.
</commit_message>
<xml_diff>
--- a/docs/word-files/05_system_design.docx
+++ b/docs/word-files/05_system_design.docx
@@ -33,7 +33,7 @@
         <w:pStyle w:val="BodyText"/>
       </w:pPr>
       <w:r>
-        <w:t xml:space="preserve">It covers design only. Implementation begins in Stage 6 with the deterministic baseline.</w:t>
+        <w:t xml:space="preserve">It describes the system as built. Where the implementation departed from the original design, the section says so and the reason is recorded in section 17.</w:t>
       </w:r>
     </w:p>
     <w:bookmarkEnd w:id="20"/>
@@ -467,7 +467,7 @@
         <w:rPr>
           <w:rStyle w:val="VerbatimChar"/>
         </w:rPr>
-        <w:t xml:space="preserve">├── main.py                 FastAPI application, router registration</w:t>
+        <w:t xml:space="preserve">├── cli.py                  Command line: init, run, status, verify, report, serve, reset</w:t>
       </w:r>
       <w:r>
         <w:br/>
@@ -494,7 +494,7 @@
         <w:rPr>
           <w:rStyle w:val="VerbatimChar"/>
         </w:rPr>
-        <w:t xml:space="preserve">│   ├── routes_run.py       Import, run status, dashboard</w:t>
+        <w:t xml:space="preserve">│   ├── main.py             Application factory, session, error handling</w:t>
       </w:r>
       <w:r>
         <w:br/>
@@ -503,7 +503,7 @@
         <w:rPr>
           <w:rStyle w:val="VerbatimChar"/>
         </w:rPr>
-        <w:t xml:space="preserve">│   ├── routes_review.py    Queues, item detail, decisions, batches</w:t>
+        <w:t xml:space="preserve">│   ├── common.py           Identity, messages, page and redirect helpers</w:t>
       </w:r>
       <w:r>
         <w:br/>
@@ -512,7 +512,7 @@
         <w:rPr>
           <w:rStyle w:val="VerbatimChar"/>
         </w:rPr>
-        <w:t xml:space="preserve">│   ├── routes_adjust.py    Adjustment proposal and approval</w:t>
+        <w:t xml:space="preserve">│   ├── views.py            What each screen shows; no web framework imports</w:t>
       </w:r>
       <w:r>
         <w:br/>
@@ -521,7 +521,7 @@
         <w:rPr>
           <w:rStyle w:val="VerbatimChar"/>
         </w:rPr>
-        <w:t xml:space="preserve">│   ├── routes_period.py    Close readiness, sign-off, reopen</w:t>
+        <w:t xml:space="preserve">│   ├── rendering.py        Jinja2 environment and formatting filters</w:t>
       </w:r>
       <w:r>
         <w:br/>
@@ -530,7 +530,7 @@
         <w:rPr>
           <w:rStyle w:val="VerbatimChar"/>
         </w:rPr>
-        <w:t xml:space="preserve">│   ├── routes_report.py    Report package and exports</w:t>
+        <w:t xml:space="preserve">│   ├── routes/             dashboard.py, review.py, runs.py, period.py</w:t>
       </w:r>
       <w:r>
         <w:br/>
@@ -539,7 +539,7 @@
         <w:rPr>
           <w:rStyle w:val="VerbatimChar"/>
         </w:rPr>
-        <w:t xml:space="preserve">│   ├── routes_audit.py     Audit log and chain verification</w:t>
+        <w:t xml:space="preserve">│   ├── templates/          One template per screen (W1..W8) plus shared layout</w:t>
       </w:r>
       <w:r>
         <w:br/>
@@ -548,16 +548,7 @@
         <w:rPr>
           <w:rStyle w:val="VerbatimChar"/>
         </w:rPr>
-        <w:t xml:space="preserve">│   ├── identity.py         Identity selector and session cookie</w:t>
-      </w:r>
-      <w:r>
-        <w:br/>
-      </w:r>
-      <w:r>
-        <w:rPr>
-          <w:rStyle w:val="VerbatimChar"/>
-        </w:rPr>
-        <w:t xml:space="preserve">│   └── templates/          Jinja2 templates, one per wireframe screen</w:t>
+        <w:t xml:space="preserve">│   └── static/app.css      Stylesheet</w:t>
       </w:r>
       <w:r>
         <w:br/>
@@ -575,7 +566,25 @@
         <w:rPr>
           <w:rStyle w:val="VerbatimChar"/>
         </w:rPr>
-        <w:t xml:space="preserve">│   ├── import_service.py       W2, UC-01</w:t>
+        <w:t xml:space="preserve">│   ├── container.py            Builds every service from configuration</w:t>
+      </w:r>
+      <w:r>
+        <w:br/>
+      </w:r>
+      <w:r>
+        <w:rPr>
+          <w:rStyle w:val="VerbatimChar"/>
+        </w:rPr>
+        <w:t xml:space="preserve">│   ├── run_service.py          W2: controls in front of import, validation, matching</w:t>
+      </w:r>
+      <w:r>
+        <w:br/>
+      </w:r>
+      <w:r>
+        <w:rPr>
+          <w:rStyle w:val="VerbatimChar"/>
+        </w:rPr>
+        <w:t xml:space="preserve">│   ├── import_service.py       UC-01</w:t>
       </w:r>
       <w:r>
         <w:br/>
@@ -593,7 +602,7 @@
         <w:rPr>
           <w:rStyle w:val="VerbatimChar"/>
         </w:rPr>
-        <w:t xml:space="preserve">│   ├── matching_service.py     UC-03, orchestrates domain layer</w:t>
+        <w:t xml:space="preserve">│   ├── matching_service.py     UC-03, orchestrates the domain layer; re-proposal of released items</w:t>
       </w:r>
       <w:r>
         <w:br/>
@@ -602,7 +611,7 @@
         <w:rPr>
           <w:rStyle w:val="VerbatimChar"/>
         </w:rPr>
-        <w:t xml:space="preserve">│   ├── review_service.py       UC-04..UC-07</w:t>
+        <w:t xml:space="preserve">│   ├── review_service.py       UC-04..UC-07, batches, manual pairing</w:t>
       </w:r>
       <w:r>
         <w:br/>
@@ -620,7 +629,7 @@
         <w:rPr>
           <w:rStyle w:val="VerbatimChar"/>
         </w:rPr>
-        <w:t xml:space="preserve">│   ├── period_service.py       UC-11..UC-13</w:t>
+        <w:t xml:space="preserve">│   ├── period_service.py       UC-11..UC-13, the bank-to-book statement</w:t>
       </w:r>
       <w:r>
         <w:br/>
@@ -629,7 +638,7 @@
         <w:rPr>
           <w:rStyle w:val="VerbatimChar"/>
         </w:rPr>
-        <w:t xml:space="preserve">│   ├── report_service.py       UC-10, RPT-01..13</w:t>
+        <w:t xml:space="preserve">│   ├── report_service.py       UC-10, package and report check</w:t>
       </w:r>
       <w:r>
         <w:br/>
@@ -638,7 +647,16 @@
         <w:rPr>
           <w:rStyle w:val="VerbatimChar"/>
         </w:rPr>
-        <w:t xml:space="preserve">│   └── evaluation_service.py   UC-15, reads ground truth</w:t>
+        <w:t xml:space="preserve">│   ├── report_builders.py      Data for RPT-01..13</w:t>
+      </w:r>
+      <w:r>
+        <w:br/>
+      </w:r>
+      <w:r>
+        <w:rPr>
+          <w:rStyle w:val="VerbatimChar"/>
+        </w:rPr>
+        <w:t xml:space="preserve">│   └── blocked.py              BLOCKED_ATTEMPT events for every service</w:t>
       </w:r>
       <w:r>
         <w:br/>
@@ -656,7 +674,16 @@
         <w:rPr>
           <w:rStyle w:val="VerbatimChar"/>
         </w:rPr>
-        <w:t xml:space="preserve">│   ├── permissions.py      Role and category checks (CR-01, CR-02)</w:t>
+        <w:t xml:space="preserve">│   ├── errors.py           ControlViolation and error codes</w:t>
+      </w:r>
+      <w:r>
+        <w:br/>
+      </w:r>
+      <w:r>
+        <w:rPr>
+          <w:rStyle w:val="VerbatimChar"/>
+        </w:rPr>
+        <w:t xml:space="preserve">│   ├── permissions.py      Permission matrix, levels, offered actions, comment rule</w:t>
       </w:r>
       <w:r>
         <w:br/>
@@ -674,7 +701,16 @@
         <w:rPr>
           <w:rStyle w:val="VerbatimChar"/>
         </w:rPr>
-        <w:t xml:space="preserve">│   ├── period_lock.py      Lock and validation gates (CR-17, CR-18)</w:t>
+        <w:t xml:space="preserve">│   ├── states.py           Allowed status transitions from the DOC-03 state models</w:t>
+      </w:r>
+      <w:r>
+        <w:br/>
+      </w:r>
+      <w:r>
+        <w:rPr>
+          <w:rStyle w:val="VerbatimChar"/>
+        </w:rPr>
+        <w:t xml:space="preserve">│   ├── period_lock.py      Lock, stage gates, close conditions (CR-10, CR-17, CR-18)</w:t>
       </w:r>
       <w:r>
         <w:br/>
@@ -710,7 +746,7 @@
         <w:rPr>
           <w:rStyle w:val="VerbatimChar"/>
         </w:rPr>
-        <w:t xml:space="preserve">│   ├── candidates.py       Candidate and group generation</w:t>
+        <w:t xml:space="preserve">│   ├── normalize.py        Normalization with originals kept</w:t>
       </w:r>
       <w:r>
         <w:br/>
@@ -719,7 +755,7 @@
         <w:rPr>
           <w:rStyle w:val="VerbatimChar"/>
         </w:rPr>
-        <w:t xml:space="preserve">│   ├── features.py         Five scoring features</w:t>
+        <w:t xml:space="preserve">│   ├── candidates.py       Candidate and group generation</w:t>
       </w:r>
       <w:r>
         <w:br/>
@@ -728,7 +764,7 @@
         <w:rPr>
           <w:rStyle w:val="VerbatimChar"/>
         </w:rPr>
-        <w:t xml:space="preserve">│   ├── scoring.py          Weighted score and ranking</w:t>
+        <w:t xml:space="preserve">│   ├── features.py, text.py, scoring.py, calibration.py</w:t>
       </w:r>
       <w:r>
         <w:br/>
@@ -737,7 +773,7 @@
         <w:rPr>
           <w:rStyle w:val="VerbatimChar"/>
         </w:rPr>
-        <w:t xml:space="preserve">│   ├── calibration.py      Score to calibrated confidence</w:t>
+        <w:t xml:space="preserve">│   ├── risk.py             BR-13..BR-15 risk and routing</w:t>
       </w:r>
       <w:r>
         <w:br/>
@@ -746,7 +782,7 @@
         <w:rPr>
           <w:rStyle w:val="VerbatimChar"/>
         </w:rPr>
-        <w:t xml:space="preserve">│   ├── risk.py             BR-15 risk rules</w:t>
+        <w:t xml:space="preserve">│   ├── exceptions.py       EXC-01..08 catalogue</w:t>
       </w:r>
       <w:r>
         <w:br/>
@@ -755,7 +791,7 @@
         <w:rPr>
           <w:rStyle w:val="VerbatimChar"/>
         </w:rPr>
-        <w:t xml:space="preserve">│   └── explanation.py      Supporting and conflicting evidence</w:t>
+        <w:t xml:space="preserve">│   ├── explanation.py      Supporting and conflicting evidence</w:t>
       </w:r>
       <w:r>
         <w:br/>
@@ -764,7 +800,7 @@
         <w:rPr>
           <w:rStyle w:val="VerbatimChar"/>
         </w:rPr>
-        <w:t xml:space="preserve">├── infra/</w:t>
+        <w:t xml:space="preserve">│   ├── statement.py        Bank-to-book arithmetic (BR-17)</w:t>
       </w:r>
       <w:r>
         <w:br/>
@@ -773,7 +809,7 @@
         <w:rPr>
           <w:rStyle w:val="VerbatimChar"/>
         </w:rPr>
-        <w:t xml:space="preserve">│   ├── db.py               Engine, schema bootstrap, transactions</w:t>
+        <w:t xml:space="preserve">│   └── manual_match.py     Checks for a hand-selected pairing</w:t>
       </w:r>
       <w:r>
         <w:br/>
@@ -782,7 +818,7 @@
         <w:rPr>
           <w:rStyle w:val="VerbatimChar"/>
         </w:rPr>
-        <w:t xml:space="preserve">│   ├── repositories/       One module per aggregate</w:t>
+        <w:t xml:space="preserve">└── infra/</w:t>
       </w:r>
       <w:r>
         <w:br/>
@@ -791,7 +827,7 @@
         <w:rPr>
           <w:rStyle w:val="VerbatimChar"/>
         </w:rPr>
-        <w:t xml:space="preserve">│   ├── audit.py            Event builder, hash chain, verification</w:t>
+        <w:t xml:space="preserve">    ├── db.py               Connection, schema bootstrap, transactions</w:t>
       </w:r>
       <w:r>
         <w:br/>
@@ -800,7 +836,7 @@
         <w:rPr>
           <w:rStyle w:val="VerbatimChar"/>
         </w:rPr>
-        <w:t xml:space="preserve">│   ├── reports/            Renderers and templates for RPT-01..13</w:t>
+        <w:t xml:space="preserve">    ├── repositories.py     All SQL, one class per aggregate</w:t>
       </w:r>
       <w:r>
         <w:br/>
@@ -809,7 +845,7 @@
         <w:rPr>
           <w:rStyle w:val="VerbatimChar"/>
         </w:rPr>
-        <w:t xml:space="preserve">│   └── genai/              adapter.py, stub.py, gemini.py</w:t>
+        <w:t xml:space="preserve">    ├── audit.py            Event builder, hash chain, verification</w:t>
       </w:r>
       <w:r>
         <w:br/>
@@ -818,7 +854,24 @@
         <w:rPr>
           <w:rStyle w:val="VerbatimChar"/>
         </w:rPr>
-        <w:t xml:space="preserve">└── cli.py                  Command line entry points</w:t>
+        <w:t xml:space="preserve">    ├── reports/            Renderer and the one report template</w:t>
+      </w:r>
+      <w:r>
+        <w:br/>
+      </w:r>
+      <w:r>
+        <w:rPr>
+          <w:rStyle w:val="VerbatimChar"/>
+        </w:rPr>
+        <w:t xml:space="preserve">    └── genai/              Provider-neutral adapter, offline stub, Gemini option</w:t>
+      </w:r>
+    </w:p>
+    <w:p>
+      <w:pPr>
+        <w:pStyle w:val="FirstParagraph"/>
+      </w:pPr>
+      <w:r>
+        <w:t xml:space="preserve">Revised in Stage 8: the web layer separates view functions from routes so every screen can be built and checked without a server (ADR-22); repositories are one module rather than a package (ADR-29); the evaluation service arrives with the evaluation stage.</w:t>
       </w:r>
     </w:p>
     <w:bookmarkEnd w:id="24"/>
@@ -964,7 +1017,37 @@
               <w:jc w:val="left"/>
             </w:pPr>
             <w:r>
-              <w:t xml:space="preserve">Typed request handling and automatic input validation; Flask would need the same checks written by hand</w:t>
+              <w:t xml:space="preserve">Typed request handling and automatic input validation; Flask would need the same checks written by hand. Brings</w:t>
+            </w:r>
+            <w:r>
+              <w:t xml:space="preserve"> </w:t>
+            </w:r>
+            <w:r>
+              <w:rPr>
+                <w:rStyle w:val="VerbatimChar"/>
+              </w:rPr>
+              <w:t xml:space="preserve">python-multipart</w:t>
+            </w:r>
+            <w:r>
+              <w:t xml:space="preserve"> </w:t>
+            </w:r>
+            <w:r>
+              <w:t xml:space="preserve">for form posts and file uploads, and uses</w:t>
+            </w:r>
+            <w:r>
+              <w:t xml:space="preserve"> </w:t>
+            </w:r>
+            <w:r>
+              <w:rPr>
+                <w:rStyle w:val="VerbatimChar"/>
+              </w:rPr>
+              <w:t xml:space="preserve">itsdangerous</w:t>
+            </w:r>
+            <w:r>
+              <w:t xml:space="preserve"> </w:t>
+            </w:r>
+            <w:r>
+              <w:t xml:space="preserve">to sign the session cookie</w:t>
             </w:r>
           </w:p>
         </w:tc>
@@ -1040,7 +1123,7 @@
               <w:jc w:val="left"/>
             </w:pPr>
             <w:r>
-              <w:t xml:space="preserve">Server-rendered pages keep the whole request path inspectable; a front-end framework would add build tooling without changing what reviewers see</w:t>
+              <w:t xml:space="preserve">Server-rendered pages keep the whole request path inspectable; a front-end framework would add build tooling without changing what reviewers see. Also renders the 13 reports</w:t>
             </w:r>
           </w:p>
         </w:tc>
@@ -1280,7 +1363,7 @@
         <w:pStyle w:val="BodyText"/>
       </w:pPr>
       <w:r>
-        <w:t xml:space="preserve">Deliberately not used: an ORM, a migrations framework, a task queue, Docker, a front-end framework, a cloud service, or any paid API. Stages 6 and 7 run on the standard library plus scikit-learn; the first third-party import happens in the web layer.</w:t>
+        <w:t xml:space="preserve">Deliberately not used: an ORM, a migrations framework, a task queue, Docker, a front-end framework, JavaScript beyond two one-line form submits, a cloud service, or any paid API. Matching runs on the standard library plus scikit-learn; Jinja2 and the web packages are needed only for reports and the interface.</w:t>
       </w:r>
     </w:p>
     <w:bookmarkEnd w:id="26"/>
@@ -1412,7 +1495,19 @@
               <w:jc w:val="left"/>
             </w:pPr>
             <w:r>
-              <w:t xml:space="preserve">One module per aggregate (run, transactions, recommendations, decisions, adjustments, period, audit, reports). Services never write SQL</w:t>
+              <w:t xml:space="preserve">One class per aggregate (users, accounts, runs, files, items, validation, normalization, recommendations, decisions, adjustments, period, reports) in</w:t>
+            </w:r>
+            <w:r>
+              <w:t xml:space="preserve"> </w:t>
+            </w:r>
+            <w:r>
+              <w:rPr>
+                <w:rStyle w:val="VerbatimChar"/>
+              </w:rPr>
+              <w:t xml:space="preserve">infra/repositories.py</w:t>
+            </w:r>
+            <w:r>
+              <w:t xml:space="preserve">. Services never write SQL</w:t>
             </w:r>
           </w:p>
         </w:tc>
@@ -1439,6 +1534,58 @@
             </w:pPr>
             <w:r>
               <w:t xml:space="preserve">The service owns the boundary. Each request opens one transaction; the change and its audit event commit together, or neither does (CR-08)</w:t>
+            </w:r>
+          </w:p>
+        </w:tc>
+      </w:tr>
+      <w:tr>
+        <w:tc>
+          <w:tcPr/>
+          <w:p>
+            <w:pPr>
+              <w:pStyle w:val="Compact"/>
+              <w:jc w:val="left"/>
+            </w:pPr>
+            <w:r>
+              <w:t xml:space="preserve">Reads that guard a write</w:t>
+            </w:r>
+          </w:p>
+        </w:tc>
+        <w:tc>
+          <w:tcPr/>
+          <w:p>
+            <w:pPr>
+              <w:pStyle w:val="Compact"/>
+              <w:jc w:val="left"/>
+            </w:pPr>
+            <w:r>
+              <w:t xml:space="preserve">Taken on the transaction’s own connection. A permission or separation-of-duties check therefore sees exactly the uncommitted state the write will change; status changes read the previous status the same way</w:t>
+            </w:r>
+          </w:p>
+        </w:tc>
+      </w:tr>
+      <w:tr>
+        <w:tc>
+          <w:tcPr/>
+          <w:p>
+            <w:pPr>
+              <w:pStyle w:val="Compact"/>
+              <w:jc w:val="left"/>
+            </w:pPr>
+            <w:r>
+              <w:t xml:space="preserve">Request handling</w:t>
+            </w:r>
+          </w:p>
+        </w:tc>
+        <w:tc>
+          <w:tcPr/>
+          <w:p>
+            <w:pPr>
+              <w:pStyle w:val="Compact"/>
+              <w:jc w:val="left"/>
+            </w:pPr>
+            <w:r>
+              <w:t xml:space="preserve">One SQLite connection, one request at a time: handlers are asynchronous and never await during database work (ADR-21)</w:t>
             </w:r>
           </w:p>
         </w:tc>
@@ -3134,7 +3281,7 @@
               <w:jc w:val="left"/>
             </w:pPr>
             <w:r>
-              <w:t xml:space="preserve">Risk descending, then confidence ascending, then amount descending. The least certain work surfaces first</w:t>
+              <w:t xml:space="preserve">Risk descending, then confidence ascending, then identifier. The least certain work surfaces first</w:t>
             </w:r>
           </w:p>
         </w:tc>
@@ -3160,7 +3307,33 @@
               <w:jc w:val="left"/>
             </w:pPr>
             <w:r>
-              <w:t xml:space="preserve">Low-confidence items cannot be hidden. The interface offers sorting, never a confidence filter (CR-15)</w:t>
+              <w:t xml:space="preserve">Low-confidence items cannot be hidden. The interface offers queues and ordering, never a confidence filter (CR-15)</w:t>
+            </w:r>
+          </w:p>
+        </w:tc>
+      </w:tr>
+      <w:tr>
+        <w:tc>
+          <w:tcPr/>
+          <w:p>
+            <w:pPr>
+              <w:pStyle w:val="Compact"/>
+              <w:jc w:val="left"/>
+            </w:pPr>
+            <w:r>
+              <w:t xml:space="preserve">Senior queue</w:t>
+            </w:r>
+          </w:p>
+        </w:tc>
+        <w:tc>
+          <w:tcPr/>
+          <w:p>
+            <w:pPr>
+              <w:pStyle w:val="Compact"/>
+              <w:jc w:val="left"/>
+            </w:pPr>
+            <w:r>
+              <w:t xml:space="preserve">CAT-05 plus every escalated item, wherever it was first routed (FR-REV-08)</w:t>
             </w:r>
           </w:p>
         </w:tc>
@@ -3186,7 +3359,7 @@
               <w:jc w:val="left"/>
             </w:pPr>
             <w:r>
-              <w:t xml:space="preserve">Approving a non-exact item requires the detail view to have been opened; the route rejects a decision with no recorded open time (FR-REV-10)</w:t>
+              <w:t xml:space="preserve">Approving or modifying a non-exact item requires the reviewer’s own DETAIL_OPENED event. The service reads it from the audit log, never from a value the browser sends (FR-REV-10)</w:t>
             </w:r>
           </w:p>
         </w:tc>
@@ -3221,7 +3394,7 @@
               <w:t xml:space="preserve"> </w:t>
             </w:r>
             <w:r>
-              <w:t xml:space="preserve">is set when the detail view is served,</w:t>
+              <w:t xml:space="preserve">comes from that event,</w:t>
             </w:r>
             <w:r>
               <w:t xml:space="preserve"> </w:t>
@@ -3236,7 +3409,7 @@
               <w:t xml:space="preserve"> </w:t>
             </w:r>
             <w:r>
-              <w:t xml:space="preserve">when the decision posts. Both are stored on the decision (DD-04)</w:t>
+              <w:t xml:space="preserve">from the decision. Both are stored on the decision, so time per item is measured (DD-04)</w:t>
             </w:r>
           </w:p>
         </w:tc>
@@ -3262,22 +3435,59 @@
               <w:jc w:val="left"/>
             </w:pPr>
             <w:r>
-              <w:t xml:space="preserve">Enforced in</w:t>
-            </w:r>
-            <w:r>
-              <w:t xml:space="preserve"> </w:t>
-            </w:r>
-            <w:r>
-              <w:rPr>
-                <w:rStyle w:val="VerbatimChar"/>
-              </w:rPr>
-              <w:t xml:space="preserve">control/permissions.py</w:t>
-            </w:r>
-            <w:r>
-              <w:t xml:space="preserve"> </w:t>
-            </w:r>
-            <w:r>
-              <w:t xml:space="preserve">for reject, modify, escalate, unresolved and any High-risk approval (CR-16)</w:t>
+              <w:t xml:space="preserve">Reject, modify, escalate, unresolved and any High-risk approval (CR-16)</w:t>
+            </w:r>
+          </w:p>
+        </w:tc>
+      </w:tr>
+      <w:tr>
+        <w:tc>
+          <w:tcPr/>
+          <w:p>
+            <w:pPr>
+              <w:pStyle w:val="Compact"/>
+              <w:jc w:val="left"/>
+            </w:pPr>
+            <w:r>
+              <w:t xml:space="preserve">Offered actions</w:t>
+            </w:r>
+          </w:p>
+        </w:tc>
+        <w:tc>
+          <w:tcPr/>
+          <w:p>
+            <w:pPr>
+              <w:pStyle w:val="Compact"/>
+              <w:jc w:val="left"/>
+            </w:pPr>
+            <w:r>
+              <w:t xml:space="preserve">Per category and level (FR-REV-04). Reject and modify apply to matches only. Duplicates, unexplained items and capped searches (EXC-05, EXC-07, EXC-08) cannot be approved: approving would mark unexplained money reconciled (ADR-25)</w:t>
+            </w:r>
+          </w:p>
+        </w:tc>
+      </w:tr>
+      <w:tr>
+        <w:tc>
+          <w:tcPr/>
+          <w:p>
+            <w:pPr>
+              <w:pStyle w:val="Compact"/>
+              <w:jc w:val="left"/>
+            </w:pPr>
+            <w:r>
+              <w:t xml:space="preserve">Approve</w:t>
+            </w:r>
+          </w:p>
+        </w:tc>
+        <w:tc>
+          <w:tcPr/>
+          <w:p>
+            <w:pPr>
+              <w:pStyle w:val="Compact"/>
+              <w:jc w:val="left"/>
+            </w:pPr>
+            <w:r>
+              <w:t xml:space="preserve">The leading candidate, or the exception disposition. No candidate is preselected on screen</w:t>
             </w:r>
           </w:p>
         </w:tc>
@@ -3303,7 +3513,7 @@
               <w:jc w:val="left"/>
             </w:pPr>
             <w:r>
-              <w:t xml:space="preserve">Stores the chosen candidate; the original recommendation and all candidates stay untouched</w:t>
+              <w:t xml:space="preserve">Selects another candidate of the same recommendation; the original and all candidates stay unchanged</w:t>
             </w:r>
           </w:p>
         </w:tc>
@@ -3329,7 +3539,7 @@
               <w:jc w:val="left"/>
             </w:pPr>
             <w:r>
-              <w:t xml:space="preserve">Marks the recommendation superseded and re-proposes the item with its next candidate or as an exception</w:t>
+              <w:t xml:space="preserve">Marks the recommendation superseded and re-proposes each released record as an exception, classified by the matching rules (ADR-24)</w:t>
             </w:r>
           </w:p>
         </w:tc>
@@ -3355,35 +3565,98 @@
               <w:jc w:val="left"/>
             </w:pPr>
             <w:r>
-              <w:t xml:space="preserve">Sets status escalated and records the escalating user, which</w:t>
-            </w:r>
-            <w:r>
-              <w:t xml:space="preserve"> </w:t>
-            </w:r>
-            <w:r>
-              <w:rPr>
-                <w:rStyle w:val="VerbatimChar"/>
-              </w:rPr>
-              <w:t xml:space="preserve">control/duties.py</w:t>
-            </w:r>
-            <w:r>
-              <w:t xml:space="preserve"> </w:t>
-            </w:r>
-            <w:r>
-              <w:t xml:space="preserve">later reads for CR-03</w:t>
+              <w:t xml:space="preserve">Item status escalated; the escalating user is read later for CR-03</w:t>
+            </w:r>
+          </w:p>
+        </w:tc>
+      </w:tr>
+      <w:tr>
+        <w:tc>
+          <w:tcPr/>
+          <w:p>
+            <w:pPr>
+              <w:pStyle w:val="Compact"/>
+              <w:jc w:val="left"/>
+            </w:pPr>
+            <w:r>
+              <w:t xml:space="preserve">Manual pairing</w:t>
+            </w:r>
+          </w:p>
+        </w:tc>
+        <w:tc>
+          <w:tcPr/>
+          <w:p>
+            <w:pPr>
+              <w:pStyle w:val="Compact"/>
+              <w:jc w:val="left"/>
+            </w:pPr>
+            <w:r>
+              <w:t xml:space="preserve">For exceptions only. The reviewer selects records from the other side; the system checks they are free and agree to the cent, adds the pairing as an unscored candidate, and records a modify decision (ADR-23)</w:t>
+            </w:r>
+          </w:p>
+        </w:tc>
+      </w:tr>
+      <w:tr>
+        <w:tc>
+          <w:tcPr/>
+          <w:p>
+            <w:pPr>
+              <w:pStyle w:val="Compact"/>
+              <w:jc w:val="left"/>
+            </w:pPr>
+            <w:r>
+              <w:t xml:space="preserve">Settling a record</w:t>
+            </w:r>
+          </w:p>
+        </w:tc>
+        <w:tc>
+          <w:tcPr/>
+          <w:p>
+            <w:pPr>
+              <w:pStyle w:val="Compact"/>
+              <w:jc w:val="left"/>
+            </w:pPr>
+            <w:r>
+              <w:t xml:space="preserve">Approve, modify and unresolved settle every other open proposal for the same records: an exception raised for the record is superseded; another open match refuses the decision. Superseding a CAT-05 or escalated exception requires an independent senior (ADR-26)</w:t>
+            </w:r>
+          </w:p>
+        </w:tc>
+      </w:tr>
+      <w:tr>
+        <w:tc>
+          <w:tcPr/>
+          <w:p>
+            <w:pPr>
+              <w:pStyle w:val="Compact"/>
+              <w:jc w:val="left"/>
+            </w:pPr>
+            <w:r>
+              <w:t xml:space="preserve">Refusals</w:t>
+            </w:r>
+          </w:p>
+        </w:tc>
+        <w:tc>
+          <w:tcPr/>
+          <w:p>
+            <w:pPr>
+              <w:pStyle w:val="Compact"/>
+              <w:jc w:val="left"/>
+            </w:pPr>
+            <w:r>
+              <w:t xml:space="preserve">Every check runs inside the transaction. A refusal rolls back, then a BLOCKED_ATTEMPT event names the rule (ADR-12)</w:t>
             </w:r>
           </w:p>
         </w:tc>
       </w:tr>
     </w:tbl>
     <w:bookmarkEnd w:id="34"/>
-    <w:bookmarkStart w:id="35" w:name="Xe83ccdd7aca834bc838a7578df944c5e1d865c2"/>
+    <w:bookmarkStart w:id="35" w:name="batch-approval-dd-02"/>
     <w:p>
       <w:pPr>
         <w:pStyle w:val="Heading3"/>
       </w:pPr>
       <w:r>
-        <w:t xml:space="preserve">7.1 Batch approval (DD-02, pending confirmation)</w:t>
+        <w:t xml:space="preserve">7.1 Batch approval (DD-02)</w:t>
       </w:r>
     </w:p>
     <w:p>
@@ -3391,27 +3664,7 @@
         <w:pStyle w:val="FirstParagraph"/>
       </w:pPr>
       <w:r>
-        <w:t xml:space="preserve">A batch is assembled from CAT-01 items with Low risk only, and the reviewer may remove any item before approving. One submission opens one transaction and, per item, writes a decision record and an audit event; a batch rejection writes one rejection per item and returns each for re-proposal.</w:t>
-      </w:r>
-    </w:p>
-    <w:p>
-      <w:pPr>
-        <w:pStyle w:val="BodyText"/>
-      </w:pPr>
-      <w:r>
-        <w:t xml:space="preserve">The batch identifier is stored on each decision, so reporting can show both the batch action and the individual records. All of this lives in</w:t>
-      </w:r>
-      <w:r>
-        <w:t xml:space="preserve"> </w:t>
-      </w:r>
-      <w:r>
-        <w:rPr>
-          <w:rStyle w:val="VerbatimChar"/>
-        </w:rPr>
-        <w:t xml:space="preserve">review_service.approve_batch</w:t>
-      </w:r>
-      <w:r>
-        <w:t xml:space="preserve">, and the alternative rulings, one decision for the whole batch, or no batching at all, change that function and the W4 template only.</w:t>
+        <w:t xml:space="preserve">A batch holds open CAT-01 items with Low risk only, all ticked by default, and the reviewer may untick any. One submission opens one transaction and, per item, writes a decision and an audit event; a batch rejection writes one rejection per item and re-proposes each released record. One ineligible item refuses the whole batch rather than being skipped silently (CR-11). The batch identifier is stored on each decision, so reports show both the action and the individual records.</w:t>
       </w:r>
     </w:p>
     <w:bookmarkEnd w:id="35"/>
@@ -3474,6 +3727,56 @@
               <w:jc w:val="left"/>
             </w:pPr>
             <w:r>
+              <w:t xml:space="preserve">Statement</w:t>
+            </w:r>
+          </w:p>
+        </w:tc>
+        <w:tc>
+          <w:tcPr/>
+          <w:p>
+            <w:pPr>
+              <w:pStyle w:val="Compact"/>
+              <w:jc w:val="left"/>
+            </w:pPr>
+            <w:r>
+              <w:rPr>
+                <w:rStyle w:val="VerbatimChar"/>
+              </w:rPr>
+              <w:t xml:space="preserve">period_service.statement()</w:t>
+            </w:r>
+            <w:r>
+              <w:t xml:space="preserve"> </w:t>
+            </w:r>
+            <w:r>
+              <w:t xml:space="preserve">builds the bank-to-book statement from the reviewer’s dispositions, not the ground truth: an item left unresolved is listed as unresolved whatever its proposed category; a hand-paired exception is a match. The arithmetic is in</w:t>
+            </w:r>
+            <w:r>
+              <w:t xml:space="preserve"> </w:t>
+            </w:r>
+            <w:r>
+              <w:rPr>
+                <w:rStyle w:val="VerbatimChar"/>
+              </w:rPr>
+              <w:t xml:space="preserve">domain/statement.py</w:t>
+            </w:r>
+            <w:r>
+              <w:t xml:space="preserve"> </w:t>
+            </w:r>
+            <w:r>
+              <w:t xml:space="preserve">and is shared with RPT-09 (DD-12)</w:t>
+            </w:r>
+          </w:p>
+        </w:tc>
+      </w:tr>
+      <w:tr>
+        <w:tc>
+          <w:tcPr/>
+          <w:p>
+            <w:pPr>
+              <w:pStyle w:val="Compact"/>
+              <w:jc w:val="left"/>
+            </w:pPr>
+            <w:r>
               <w:t xml:space="preserve">Readiness</w:t>
             </w:r>
           </w:p>
@@ -3495,33 +3798,33 @@
               <w:t xml:space="preserve"> </w:t>
             </w:r>
             <w:r>
-              <w:t xml:space="preserve">evaluates each CR-10 condition and returns them individually, so the screen shows which one is unmet rather than a single refusal</w:t>
-            </w:r>
-          </w:p>
-        </w:tc>
-      </w:tr>
-      <w:tr>
-        <w:tc>
-          <w:tcPr/>
-          <w:p>
-            <w:pPr>
-              <w:pStyle w:val="Compact"/>
-              <w:jc w:val="left"/>
-            </w:pPr>
-            <w:r>
-              <w:t xml:space="preserve">Sign-off</w:t>
-            </w:r>
-          </w:p>
-        </w:tc>
-        <w:tc>
-          <w:tcPr/>
-          <w:p>
-            <w:pPr>
-              <w:pStyle w:val="Compact"/>
-              <w:jc w:val="left"/>
-            </w:pPr>
-            <w:r>
-              <w:t xml:space="preserve">Requires readiness, the Controller role, CR-05, and a comment when the unresolved difference is non-zero. Writes</w:t>
+              <w:t xml:space="preserve">evaluates each CR-10 condition separately. Condition 5 requires a package generated after the latest change and no approved item left unverified</w:t>
+            </w:r>
+          </w:p>
+        </w:tc>
+      </w:tr>
+      <w:tr>
+        <w:tc>
+          <w:tcPr/>
+          <w:p>
+            <w:pPr>
+              <w:pStyle w:val="Compact"/>
+              <w:jc w:val="left"/>
+            </w:pPr>
+            <w:r>
+              <w:t xml:space="preserve">Ready to close</w:t>
+            </w:r>
+          </w:p>
+        </w:tc>
+        <w:tc>
+          <w:tcPr/>
+          <w:p>
+            <w:pPr>
+              <w:pStyle w:val="Compact"/>
+              <w:jc w:val="left"/>
+            </w:pPr>
+            <w:r>
+              <w:t xml:space="preserve">A system transition between</w:t>
             </w:r>
             <w:r>
               <w:t xml:space="preserve"> </w:t>
@@ -3530,13 +3833,63 @@
               <w:rPr>
                 <w:rStyle w:val="VerbatimChar"/>
               </w:rPr>
-              <w:t xml:space="preserve">period_signoff</w:t>
+              <w:t xml:space="preserve">in_review</w:t>
             </w:r>
             <w:r>
               <w:t xml:space="preserve"> </w:t>
             </w:r>
             <w:r>
-              <w:t xml:space="preserve">with balances and the chain-head hash, sets the run to closed, writes the lock event</w:t>
+              <w:t xml:space="preserve">and</w:t>
+            </w:r>
+            <w:r>
+              <w:t xml:space="preserve"> </w:t>
+            </w:r>
+            <w:r>
+              <w:rPr>
+                <w:rStyle w:val="VerbatimChar"/>
+              </w:rPr>
+              <w:t xml:space="preserve">ready_to_close</w:t>
+            </w:r>
+            <w:r>
+              <w:t xml:space="preserve">, re-evaluated after every package, with a STATUS_CHANGED event</w:t>
+            </w:r>
+          </w:p>
+        </w:tc>
+      </w:tr>
+      <w:tr>
+        <w:tc>
+          <w:tcPr/>
+          <w:p>
+            <w:pPr>
+              <w:pStyle w:val="Compact"/>
+              <w:jc w:val="left"/>
+            </w:pPr>
+            <w:r>
+              <w:t xml:space="preserve">Sign-off</w:t>
+            </w:r>
+          </w:p>
+        </w:tc>
+        <w:tc>
+          <w:tcPr/>
+          <w:p>
+            <w:pPr>
+              <w:pStyle w:val="Compact"/>
+              <w:jc w:val="left"/>
+            </w:pPr>
+            <w:r>
+              <w:t xml:space="preserve">Controller only, from</w:t>
+            </w:r>
+            <w:r>
+              <w:t xml:space="preserve"> </w:t>
+            </w:r>
+            <w:r>
+              <w:rPr>
+                <w:rStyle w:val="VerbatimChar"/>
+              </w:rPr>
+              <w:t xml:space="preserve">ready_to_close</w:t>
+            </w:r>
+            <w:r>
+              <w:t xml:space="preserve">, all conditions met, CR-05, and a comment when the difference is non-zero. Records the statement and the chain head as it stood at signing, then writes SIGNOFF and PERIOD_LOCKED</w:t>
             </w:r>
           </w:p>
         </w:tc>
@@ -3577,7 +3930,7 @@
               <w:t xml:space="preserve"> </w:t>
             </w:r>
             <w:r>
-              <w:t xml:space="preserve">and again by database triggers, so no code path can write to a closed run</w:t>
+              <w:t xml:space="preserve">and again by database triggers for decisions, adjustments and imports. Adjustment decisions have no run column, so their lock is the service check alone (ADR-30)</w:t>
             </w:r>
           </w:p>
         </w:tc>
@@ -3603,7 +3956,7 @@
               <w:jc w:val="left"/>
             </w:pPr>
             <w:r>
-              <w:t xml:space="preserve">A request row plus a separate decision row (CR-06). On approval the run returns to</w:t>
+              <w:t xml:space="preserve">A request with a reason, and a separate decision by a Controller who is not the requester (CR-06). A pending request does not unlock the period. Approval returns the run to</w:t>
             </w:r>
             <w:r>
               <w:t xml:space="preserve"> </w:t>
@@ -3615,7 +3968,7 @@
               <w:t xml:space="preserve">in_review</w:t>
             </w:r>
             <w:r>
-              <w:t xml:space="preserve">, both states are recorded, and RPT-10 picks up the change</w:t>
+              <w:t xml:space="preserve">; both states are recorded</w:t>
             </w:r>
           </w:p>
         </w:tc>
@@ -3641,7 +3994,7 @@
               <w:jc w:val="left"/>
             </w:pPr>
             <w:r>
-              <w:t xml:space="preserve">Requires a fresh sign-off; the earlier sign-off row remains</w:t>
+              <w:t xml:space="preserve">Needs a new package and a new sign-off; the earlier sign-off stays on record</w:t>
             </w:r>
           </w:p>
         </w:tc>
@@ -3706,33 +4059,7 @@
               <w:jc w:val="left"/>
             </w:pPr>
             <w:r>
-              <w:t xml:space="preserve">Rendering</w:t>
-            </w:r>
-          </w:p>
-        </w:tc>
-        <w:tc>
-          <w:tcPr/>
-          <w:p>
-            <w:pPr>
-              <w:pStyle w:val="Compact"/>
-              <w:jc w:val="left"/>
-            </w:pPr>
-            <w:r>
-              <w:t xml:space="preserve">One Jinja2 template per report, rendered to HTML; the same data set is written to CSV</w:t>
-            </w:r>
-          </w:p>
-        </w:tc>
-      </w:tr>
-      <w:tr>
-        <w:tc>
-          <w:tcPr/>
-          <w:p>
-            <w:pPr>
-              <w:pStyle w:val="Compact"/>
-              <w:jc w:val="left"/>
-            </w:pPr>
-            <w:r>
-              <w:t xml:space="preserve">Package</w:t>
+              <w:t xml:space="preserve">Building</w:t>
             </w:r>
           </w:p>
         </w:tc>
@@ -3747,80 +4074,153 @@
               <w:rPr>
                 <w:rStyle w:val="VerbatimChar"/>
               </w:rPr>
-              <w:t xml:space="preserve">report_service.build_package()</w:t>
+              <w:t xml:space="preserve">report_builders.py</w:t>
             </w:r>
             <w:r>
               <w:t xml:space="preserve"> </w:t>
             </w:r>
             <w:r>
-              <w:t xml:space="preserve">produces RPT-01..13, stores each with its SHA-256 content hash, and returns the package index</w:t>
-            </w:r>
-          </w:p>
-        </w:tc>
-      </w:tr>
-      <w:tr>
-        <w:tc>
-          <w:tcPr/>
-          <w:p>
-            <w:pPr>
-              <w:pStyle w:val="Compact"/>
-              <w:jc w:val="left"/>
-            </w:pPr>
-            <w:r>
-              <w:t xml:space="preserve">Reproducibility</w:t>
-            </w:r>
-          </w:p>
-        </w:tc>
-        <w:tc>
-          <w:tcPr/>
-          <w:p>
-            <w:pPr>
-              <w:pStyle w:val="Compact"/>
-              <w:jc w:val="left"/>
-            </w:pPr>
-            <w:r>
-              <w:t xml:space="preserve">Report queries are ordered deterministically and use business dates, so identical input yields identical output apart from the generation timestamp, which is excluded from the content hash (FR-RPT-04)</w:t>
-            </w:r>
-          </w:p>
-        </w:tc>
-      </w:tr>
-      <w:tr>
-        <w:tc>
-          <w:tcPr/>
-          <w:p>
-            <w:pPr>
-              <w:pStyle w:val="Compact"/>
-              <w:jc w:val="left"/>
-            </w:pPr>
-            <w:r>
-              <w:t xml:space="preserve">Report check</w:t>
-            </w:r>
-          </w:p>
-        </w:tc>
-        <w:tc>
-          <w:tcPr/>
-          <w:p>
-            <w:pPr>
-              <w:pStyle w:val="Compact"/>
-              <w:jc w:val="left"/>
-            </w:pPr>
-            <w:r>
-              <w:t xml:space="preserve">After rendering,</w:t>
-            </w:r>
-            <w:r>
-              <w:t xml:space="preserve"> </w:t>
-            </w:r>
+              <w:t xml:space="preserve">reads the run once and returns each report as data: summary figures, tables and notes. Ground truth is never read</w:t>
+            </w:r>
+          </w:p>
+        </w:tc>
+      </w:tr>
+      <w:tr>
+        <w:tc>
+          <w:tcPr/>
+          <w:p>
+            <w:pPr>
+              <w:pStyle w:val="Compact"/>
+              <w:jc w:val="left"/>
+            </w:pPr>
+            <w:r>
+              <w:t xml:space="preserve">Rendering</w:t>
+            </w:r>
+          </w:p>
+        </w:tc>
+        <w:tc>
+          <w:tcPr/>
+          <w:p>
+            <w:pPr>
+              <w:pStyle w:val="Compact"/>
+              <w:jc w:val="left"/>
+            </w:pPr>
+            <w:r>
+              <w:t xml:space="preserve">One Jinja2 template renders all 13 reports to HTML, and the same data is written to CSV (ADR-27)</w:t>
+            </w:r>
+          </w:p>
+        </w:tc>
+      </w:tr>
+      <w:tr>
+        <w:tc>
+          <w:tcPr/>
+          <w:p>
+            <w:pPr>
+              <w:pStyle w:val="Compact"/>
+              <w:jc w:val="left"/>
+            </w:pPr>
+            <w:r>
+              <w:t xml:space="preserve">Package</w:t>
+            </w:r>
+          </w:p>
+        </w:tc>
+        <w:tc>
+          <w:tcPr/>
+          <w:p>
+            <w:pPr>
+              <w:pStyle w:val="Compact"/>
+              <w:jc w:val="left"/>
+            </w:pPr>
             <w:r>
               <w:rPr>
                 <w:rStyle w:val="VerbatimChar"/>
               </w:rPr>
-              <w:t xml:space="preserve">completion.verify_reported(items)</w:t>
+              <w:t xml:space="preserve">report_service.generate_package()</w:t>
             </w:r>
             <w:r>
               <w:t xml:space="preserve"> </w:t>
             </w:r>
             <w:r>
-              <w:t xml:space="preserve">confirms each approved item appears with the expected values, then promotes it to</w:t>
+              <w:t xml:space="preserve">builds RPT-01..13, runs the report check, writes both formats under</w:t>
+            </w:r>
+            <w:r>
+              <w:t xml:space="preserve"> </w:t>
+            </w:r>
+            <w:r>
+              <w:rPr>
+                <w:rStyle w:val="VerbatimChar"/>
+              </w:rPr>
+              <w:t xml:space="preserve">reports/run_&lt;id&gt;/</w:t>
+            </w:r>
+            <w:r>
+              <w:t xml:space="preserve">, stores each file with its content hash, and writes one REPORT_GENERATED event</w:t>
+            </w:r>
+          </w:p>
+        </w:tc>
+      </w:tr>
+      <w:tr>
+        <w:tc>
+          <w:tcPr/>
+          <w:p>
+            <w:pPr>
+              <w:pStyle w:val="Compact"/>
+              <w:jc w:val="left"/>
+            </w:pPr>
+            <w:r>
+              <w:t xml:space="preserve">Content hash</w:t>
+            </w:r>
+          </w:p>
+        </w:tc>
+        <w:tc>
+          <w:tcPr/>
+          <w:p>
+            <w:pPr>
+              <w:pStyle w:val="Compact"/>
+              <w:jc w:val="left"/>
+            </w:pPr>
+            <w:r>
+              <w:t xml:space="preserve">SHA-256 of the report’s data in canonical JSON; the generation timestamp is excluded, so an unchanged report regenerates with the same hash (FR-RPT-04, ADR-14). RPT-13 changes with every package because generating one adds an event</w:t>
+            </w:r>
+          </w:p>
+        </w:tc>
+      </w:tr>
+      <w:tr>
+        <w:tc>
+          <w:tcPr/>
+          <w:p>
+            <w:pPr>
+              <w:pStyle w:val="Compact"/>
+              <w:jc w:val="left"/>
+            </w:pPr>
+            <w:r>
+              <w:t xml:space="preserve">Report check</w:t>
+            </w:r>
+          </w:p>
+        </w:tc>
+        <w:tc>
+          <w:tcPr/>
+          <w:p>
+            <w:pPr>
+              <w:pStyle w:val="Compact"/>
+              <w:jc w:val="left"/>
+            </w:pPr>
+            <w:r>
+              <w:t xml:space="preserve">Each approved item must appear in the Match or Exception Report with its amount and an approved outcome. When all six CR-07 conditions hold it moves</w:t>
+            </w:r>
+            <w:r>
+              <w:t xml:space="preserve"> </w:t>
+            </w:r>
+            <w:r>
+              <w:rPr>
+                <w:rStyle w:val="VerbatimChar"/>
+              </w:rPr>
+              <w:t xml:space="preserve">approved</w:t>
+            </w:r>
+            <w:r>
+              <w:t xml:space="preserve"> </w:t>
+            </w:r>
+            <w:r>
+              <w:t xml:space="preserve">→</w:t>
             </w:r>
             <w:r>
               <w:t xml:space="preserve"> </w:t>
@@ -3835,7 +4235,7 @@
               <w:t xml:space="preserve"> </w:t>
             </w:r>
             <w:r>
-              <w:t xml:space="preserve">and on to</w:t>
+              <w:t xml:space="preserve">→</w:t>
             </w:r>
             <w:r>
               <w:t xml:space="preserve"> </w:t>
@@ -3847,10 +4247,48 @@
               <w:t xml:space="preserve">reconciled</w:t>
             </w:r>
             <w:r>
+              <w:t xml:space="preserve">, with one REPORT_VERIFIED event per recommendation. Nothing else sets</w:t>
+            </w:r>
+            <w:r>
               <w:t xml:space="preserve"> </w:t>
             </w:r>
             <w:r>
-              <w:t xml:space="preserve">(FR-RPT-05, CR-07)</w:t>
+              <w:rPr>
+                <w:rStyle w:val="VerbatimChar"/>
+              </w:rPr>
+              <w:t xml:space="preserve">reconciled</w:t>
+            </w:r>
+            <w:r>
+              <w:t xml:space="preserve"> </w:t>
+            </w:r>
+            <w:r>
+              <w:t xml:space="preserve">(FR-RPT-05)</w:t>
+            </w:r>
+          </w:p>
+        </w:tc>
+      </w:tr>
+      <w:tr>
+        <w:tc>
+          <w:tcPr/>
+          <w:p>
+            <w:pPr>
+              <w:pStyle w:val="Compact"/>
+              <w:jc w:val="left"/>
+            </w:pPr>
+            <w:r>
+              <w:t xml:space="preserve">After close</w:t>
+            </w:r>
+          </w:p>
+        </w:tc>
+        <w:tc>
+          <w:tcPr/>
+          <w:p>
+            <w:pPr>
+              <w:pStyle w:val="Compact"/>
+              <w:jc w:val="left"/>
+            </w:pPr>
+            <w:r>
+              <w:t xml:space="preserve">A package can be regenerated; it changes no item status, and RPT-09 then shows the sign-off and the chain head recorded at signing (FR-AUD-07)</w:t>
             </w:r>
           </w:p>
         </w:tc>
@@ -3897,7 +4335,7 @@
         <w:pStyle w:val="FirstParagraph"/>
       </w:pPr>
       <w:r>
-        <w:t xml:space="preserve">HTML routes serve the reviewer interface. JSON routes exist only where a machine-readable result is useful. Every route that changes data is a POST, runs inside one transaction, and writes an audit event.</w:t>
+        <w:t xml:space="preserve">HTML routes serve the reviewer interface; two JSON routes exist where a machine-readable result is useful. Every route that changes data is a POST, calls one service method inside one transaction, and writes an audit event. Every page is viewable by any identity; actions an identity may not take are shown disabled with the rule that blocks them.</w:t>
       </w:r>
     </w:p>
     <w:tbl>
@@ -3949,7 +4387,7 @@
               <w:jc w:val="left"/>
             </w:pPr>
             <w:r>
-              <w:t xml:space="preserve">Roles</w:t>
+              <w:t xml:space="preserve">May act</w:t>
             </w:r>
           </w:p>
         </w:tc>
@@ -4008,7 +4446,7 @@
               <w:jc w:val="left"/>
             </w:pPr>
             <w:r>
-              <w:t xml:space="preserve">any</w:t>
+              <w:t xml:space="preserve">—</w:t>
             </w:r>
           </w:p>
         </w:tc>
@@ -4102,19 +4540,78 @@
               <w:rPr>
                 <w:rStyle w:val="VerbatimChar"/>
               </w:rPr>
-              <w:t xml:space="preserve">/runs/{run_id}/import</w:t>
-            </w:r>
-          </w:p>
-        </w:tc>
-        <w:tc>
-          <w:tcPr/>
-          <w:p>
-            <w:pPr>
-              <w:pStyle w:val="Compact"/>
-              <w:jc w:val="left"/>
-            </w:pPr>
-            <w:r>
-              <w:t xml:space="preserve">Import screen (W2)</w:t>
+              <w:t xml:space="preserve">/import</w:t>
+            </w:r>
+          </w:p>
+        </w:tc>
+        <w:tc>
+          <w:tcPr/>
+          <w:p>
+            <w:pPr>
+              <w:pStyle w:val="Compact"/>
+              <w:jc w:val="left"/>
+            </w:pPr>
+            <w:r>
+              <w:t xml:space="preserve">New run form (W2)</w:t>
+            </w:r>
+          </w:p>
+        </w:tc>
+        <w:tc>
+          <w:tcPr/>
+          <w:p>
+            <w:pPr>
+              <w:pStyle w:val="Compact"/>
+              <w:jc w:val="left"/>
+            </w:pPr>
+            <w:r>
+              <w:t xml:space="preserve">—</w:t>
+            </w:r>
+          </w:p>
+        </w:tc>
+        <w:tc>
+          <w:tcPr/>
+          <w:p>
+            <w:pPr>
+              <w:pStyle w:val="Compact"/>
+              <w:jc w:val="left"/>
+            </w:pPr>
+            <w:r>
+              <w:t xml:space="preserve">—</w:t>
+            </w:r>
+          </w:p>
+        </w:tc>
+      </w:tr>
+      <w:tr>
+        <w:tc>
+          <w:tcPr/>
+          <w:p>
+            <w:pPr>
+              <w:pStyle w:val="Compact"/>
+              <w:jc w:val="left"/>
+            </w:pPr>
+            <w:r>
+              <w:t xml:space="preserve">POST</w:t>
+            </w:r>
+            <w:r>
+              <w:t xml:space="preserve"> </w:t>
+            </w:r>
+            <w:r>
+              <w:rPr>
+                <w:rStyle w:val="VerbatimChar"/>
+              </w:rPr>
+              <w:t xml:space="preserve">/runs</w:t>
+            </w:r>
+          </w:p>
+        </w:tc>
+        <w:tc>
+          <w:tcPr/>
+          <w:p>
+            <w:pPr>
+              <w:pStyle w:val="Compact"/>
+              <w:jc w:val="left"/>
+            </w:pPr>
+            <w:r>
+              <w:t xml:space="preserve">Create a run</w:t>
             </w:r>
           </w:p>
         </w:tc>
@@ -4152,7 +4649,7 @@
               <w:jc w:val="left"/>
             </w:pPr>
             <w:r>
-              <w:t xml:space="preserve">POST</w:t>
+              <w:t xml:space="preserve">GET</w:t>
             </w:r>
             <w:r>
               <w:t xml:space="preserve"> </w:t>
@@ -4173,7 +4670,66 @@
               <w:jc w:val="left"/>
             </w:pPr>
             <w:r>
-              <w:t xml:space="preserve">Upload the three CSV files and the control file</w:t>
+              <w:t xml:space="preserve">Import and validation (W2)</w:t>
+            </w:r>
+          </w:p>
+        </w:tc>
+        <w:tc>
+          <w:tcPr/>
+          <w:p>
+            <w:pPr>
+              <w:pStyle w:val="Compact"/>
+              <w:jc w:val="left"/>
+            </w:pPr>
+            <w:r>
+              <w:t xml:space="preserve">—</w:t>
+            </w:r>
+          </w:p>
+        </w:tc>
+        <w:tc>
+          <w:tcPr/>
+          <w:p>
+            <w:pPr>
+              <w:pStyle w:val="Compact"/>
+              <w:jc w:val="left"/>
+            </w:pPr>
+            <w:r>
+              <w:t xml:space="preserve">—</w:t>
+            </w:r>
+          </w:p>
+        </w:tc>
+      </w:tr>
+      <w:tr>
+        <w:tc>
+          <w:tcPr/>
+          <w:p>
+            <w:pPr>
+              <w:pStyle w:val="Compact"/>
+              <w:jc w:val="left"/>
+            </w:pPr>
+            <w:r>
+              <w:t xml:space="preserve">POST</w:t>
+            </w:r>
+            <w:r>
+              <w:t xml:space="preserve"> </w:t>
+            </w:r>
+            <w:r>
+              <w:rPr>
+                <w:rStyle w:val="VerbatimChar"/>
+              </w:rPr>
+              <w:t xml:space="preserve">/runs/{run_id}/import</w:t>
+            </w:r>
+          </w:p>
+        </w:tc>
+        <w:tc>
+          <w:tcPr/>
+          <w:p>
+            <w:pPr>
+              <w:pStyle w:val="Compact"/>
+              <w:jc w:val="left"/>
+            </w:pPr>
+            <w:r>
+              <w:t xml:space="preserve">Upload the CSV files</w:t>
             </w:r>
           </w:p>
         </w:tc>
@@ -4197,7 +4753,7 @@
               <w:jc w:val="left"/>
             </w:pPr>
             <w:r>
-              <w:t xml:space="preserve">IMPORT</w:t>
+              <w:t xml:space="preserve">IMPORT or BLOCKED_ATTEMPT</w:t>
             </w:r>
           </w:p>
         </w:tc>
@@ -4232,7 +4788,7 @@
               <w:jc w:val="left"/>
             </w:pPr>
             <w:r>
-              <w:t xml:space="preserve">Run validation, normalization, rules and scoring</w:t>
+              <w:t xml:space="preserve">Validate, normalize, match and score</w:t>
             </w:r>
           </w:p>
         </w:tc>
@@ -4291,19 +4847,19 @@
               <w:jc w:val="left"/>
             </w:pPr>
             <w:r>
-              <w:t xml:space="preserve">Queue listing</w:t>
-            </w:r>
-          </w:p>
-        </w:tc>
-        <w:tc>
-          <w:tcPr/>
-          <w:p>
-            <w:pPr>
-              <w:pStyle w:val="Compact"/>
-              <w:jc w:val="left"/>
-            </w:pPr>
-            <w:r>
-              <w:t xml:space="preserve">any</w:t>
+              <w:t xml:space="preserve">Queue listing; CAT-05 is the senior queue (W6)</w:t>
+            </w:r>
+          </w:p>
+        </w:tc>
+        <w:tc>
+          <w:tcPr/>
+          <w:p>
+            <w:pPr>
+              <w:pStyle w:val="Compact"/>
+              <w:jc w:val="left"/>
+            </w:pPr>
+            <w:r>
+              <w:t xml:space="preserve">—</w:t>
             </w:r>
           </w:p>
         </w:tc>
@@ -4362,7 +4918,7 @@
               <w:jc w:val="left"/>
             </w:pPr>
             <w:r>
-              <w:t xml:space="preserve">any</w:t>
+              <w:t xml:space="preserve">—</w:t>
             </w:r>
           </w:p>
         </w:tc>
@@ -4409,19 +4965,78 @@
               <w:jc w:val="left"/>
             </w:pPr>
             <w:r>
-              <w:t xml:space="preserve">Approve, reject, modify, escalate, unresolved</w:t>
-            </w:r>
-          </w:p>
-        </w:tc>
-        <w:tc>
-          <w:tcPr/>
-          <w:p>
-            <w:pPr>
-              <w:pStyle w:val="Compact"/>
-              <w:jc w:val="left"/>
-            </w:pPr>
-            <w:r>
-              <w:t xml:space="preserve">ROL-01..03</w:t>
+              <w:t xml:space="preserve">Approve, modify, reject, escalate, unresolved</w:t>
+            </w:r>
+          </w:p>
+        </w:tc>
+        <w:tc>
+          <w:tcPr/>
+          <w:p>
+            <w:pPr>
+              <w:pStyle w:val="Compact"/>
+              <w:jc w:val="left"/>
+            </w:pPr>
+            <w:r>
+              <w:t xml:space="preserve">ROL-01..03 by level</w:t>
+            </w:r>
+          </w:p>
+        </w:tc>
+        <w:tc>
+          <w:tcPr/>
+          <w:p>
+            <w:pPr>
+              <w:pStyle w:val="Compact"/>
+              <w:jc w:val="left"/>
+            </w:pPr>
+            <w:r>
+              <w:t xml:space="preserve">DECISION or BLOCKED_ATTEMPT</w:t>
+            </w:r>
+          </w:p>
+        </w:tc>
+      </w:tr>
+      <w:tr>
+        <w:tc>
+          <w:tcPr/>
+          <w:p>
+            <w:pPr>
+              <w:pStyle w:val="Compact"/>
+              <w:jc w:val="left"/>
+            </w:pPr>
+            <w:r>
+              <w:t xml:space="preserve">POST</w:t>
+            </w:r>
+            <w:r>
+              <w:t xml:space="preserve"> </w:t>
+            </w:r>
+            <w:r>
+              <w:rPr>
+                <w:rStyle w:val="VerbatimChar"/>
+              </w:rPr>
+              <w:t xml:space="preserve">/items/{recommendation_id}/manual-match</w:t>
+            </w:r>
+          </w:p>
+        </w:tc>
+        <w:tc>
+          <w:tcPr/>
+          <w:p>
+            <w:pPr>
+              <w:pStyle w:val="Compact"/>
+              <w:jc w:val="left"/>
+            </w:pPr>
+            <w:r>
+              <w:t xml:space="preserve">Pair an exception by hand</w:t>
+            </w:r>
+          </w:p>
+        </w:tc>
+        <w:tc>
+          <w:tcPr/>
+          <w:p>
+            <w:pPr>
+              <w:pStyle w:val="Compact"/>
+              <w:jc w:val="left"/>
+            </w:pPr>
+            <w:r>
+              <w:t xml:space="preserve">ROL-01..03 by level</w:t>
             </w:r>
           </w:p>
         </w:tc>
@@ -4480,7 +5095,7 @@
               <w:jc w:val="left"/>
             </w:pPr>
             <w:r>
-              <w:t xml:space="preserve">ROL-01, ROL-02</w:t>
+              <w:t xml:space="preserve">—</w:t>
             </w:r>
           </w:p>
         </w:tc>
@@ -4624,6 +5239,65 @@
               <w:jc w:val="left"/>
             </w:pPr>
             <w:r>
+              <w:t xml:space="preserve">GET</w:t>
+            </w:r>
+            <w:r>
+              <w:t xml:space="preserve"> </w:t>
+            </w:r>
+            <w:r>
+              <w:rPr>
+                <w:rStyle w:val="VerbatimChar"/>
+              </w:rPr>
+              <w:t xml:space="preserve">/runs/{run_id}/adjustments</w:t>
+            </w:r>
+          </w:p>
+        </w:tc>
+        <w:tc>
+          <w:tcPr/>
+          <w:p>
+            <w:pPr>
+              <w:pStyle w:val="Compact"/>
+              <w:jc w:val="left"/>
+            </w:pPr>
+            <w:r>
+              <w:t xml:space="preserve">Adjustment approvals</w:t>
+            </w:r>
+          </w:p>
+        </w:tc>
+        <w:tc>
+          <w:tcPr/>
+          <w:p>
+            <w:pPr>
+              <w:pStyle w:val="Compact"/>
+              <w:jc w:val="left"/>
+            </w:pPr>
+            <w:r>
+              <w:t xml:space="preserve">—</w:t>
+            </w:r>
+          </w:p>
+        </w:tc>
+        <w:tc>
+          <w:tcPr/>
+          <w:p>
+            <w:pPr>
+              <w:pStyle w:val="Compact"/>
+              <w:jc w:val="left"/>
+            </w:pPr>
+            <w:r>
+              <w:t xml:space="preserve">—</w:t>
+            </w:r>
+          </w:p>
+        </w:tc>
+      </w:tr>
+      <w:tr>
+        <w:tc>
+          <w:tcPr/>
+          <w:p>
+            <w:pPr>
+              <w:pStyle w:val="Compact"/>
+              <w:jc w:val="left"/>
+            </w:pPr>
+            <w:r>
               <w:t xml:space="preserve">POST</w:t>
             </w:r>
             <w:r>
@@ -4704,19 +5378,19 @@
               <w:jc w:val="left"/>
             </w:pPr>
             <w:r>
-              <w:t xml:space="preserve">Close screen with statement (W7)</w:t>
-            </w:r>
-          </w:p>
-        </w:tc>
-        <w:tc>
-          <w:tcPr/>
-          <w:p>
-            <w:pPr>
-              <w:pStyle w:val="Compact"/>
-              <w:jc w:val="left"/>
-            </w:pPr>
-            <w:r>
-              <w:t xml:space="preserve">ROL-03</w:t>
+              <w:t xml:space="preserve">Statement, conditions, sign-off, reopening (W7)</w:t>
+            </w:r>
+          </w:p>
+        </w:tc>
+        <w:tc>
+          <w:tcPr/>
+          <w:p>
+            <w:pPr>
+              <w:pStyle w:val="Compact"/>
+              <w:jc w:val="left"/>
+            </w:pPr>
+            <w:r>
+              <w:t xml:space="preserve">—</w:t>
             </w:r>
           </w:p>
         </w:tc>
@@ -4919,7 +5593,7 @@
               <w:jc w:val="left"/>
             </w:pPr>
             <w:r>
-              <w:t xml:space="preserve">POST</w:t>
+              <w:t xml:space="preserve">GET, POST</w:t>
             </w:r>
             <w:r>
               <w:t xml:space="preserve"> </w:t>
@@ -4940,31 +5614,31 @@
               <w:jc w:val="left"/>
             </w:pPr>
             <w:r>
-              <w:t xml:space="preserve">Generate the package</w:t>
-            </w:r>
-          </w:p>
-        </w:tc>
-        <w:tc>
-          <w:tcPr/>
-          <w:p>
-            <w:pPr>
-              <w:pStyle w:val="Compact"/>
-              <w:jc w:val="left"/>
-            </w:pPr>
-            <w:r>
-              <w:t xml:space="preserve">any</w:t>
-            </w:r>
-          </w:p>
-        </w:tc>
-        <w:tc>
-          <w:tcPr/>
-          <w:p>
-            <w:pPr>
-              <w:pStyle w:val="Compact"/>
-              <w:jc w:val="left"/>
-            </w:pPr>
-            <w:r>
-              <w:t xml:space="preserve">REPORT_GENERATED</w:t>
+              <w:t xml:space="preserve">Package index; generate the package</w:t>
+            </w:r>
+          </w:p>
+        </w:tc>
+        <w:tc>
+          <w:tcPr/>
+          <w:p>
+            <w:pPr>
+              <w:pStyle w:val="Compact"/>
+              <w:jc w:val="left"/>
+            </w:pPr>
+            <w:r>
+              <w:t xml:space="preserve">any identity</w:t>
+            </w:r>
+          </w:p>
+        </w:tc>
+        <w:tc>
+          <w:tcPr/>
+          <w:p>
+            <w:pPr>
+              <w:pStyle w:val="Compact"/>
+              <w:jc w:val="left"/>
+            </w:pPr>
+            <w:r>
+              <w:t xml:space="preserve">REPORT_GENERATED, REPORT_VERIFIED</w:t>
             </w:r>
           </w:p>
         </w:tc>
@@ -5011,7 +5685,7 @@
               <w:jc w:val="left"/>
             </w:pPr>
             <w:r>
-              <w:t xml:space="preserve">any</w:t>
+              <w:t xml:space="preserve">—</w:t>
             </w:r>
           </w:p>
         </w:tc>
@@ -5070,7 +5744,7 @@
               <w:jc w:val="left"/>
             </w:pPr>
             <w:r>
-              <w:t xml:space="preserve">any</w:t>
+              <w:t xml:space="preserve">—</w:t>
             </w:r>
           </w:p>
         </w:tc>
@@ -5117,19 +5791,19 @@
               <w:jc w:val="left"/>
             </w:pPr>
             <w:r>
-              <w:t xml:space="preserve">Audit log (W8)</w:t>
-            </w:r>
-          </w:p>
-        </w:tc>
-        <w:tc>
-          <w:tcPr/>
-          <w:p>
-            <w:pPr>
-              <w:pStyle w:val="Compact"/>
-              <w:jc w:val="left"/>
-            </w:pPr>
-            <w:r>
-              <w:t xml:space="preserve">any</w:t>
+              <w:t xml:space="preserve">Audit log and verification (W8)</w:t>
+            </w:r>
+          </w:p>
+        </w:tc>
+        <w:tc>
+          <w:tcPr/>
+          <w:p>
+            <w:pPr>
+              <w:pStyle w:val="Compact"/>
+              <w:jc w:val="left"/>
+            </w:pPr>
+            <w:r>
+              <w:t xml:space="preserve">—</w:t>
             </w:r>
           </w:p>
         </w:tc>
@@ -5176,19 +5850,19 @@
               <w:jc w:val="left"/>
             </w:pPr>
             <w:r>
-              <w:t xml:space="preserve">Chain verification result as JSON</w:t>
-            </w:r>
-          </w:p>
-        </w:tc>
-        <w:tc>
-          <w:tcPr/>
-          <w:p>
-            <w:pPr>
-              <w:pStyle w:val="Compact"/>
-              <w:jc w:val="left"/>
-            </w:pPr>
-            <w:r>
-              <w:t xml:space="preserve">any</w:t>
+              <w:t xml:space="preserve">Chain verification as JSON</w:t>
+            </w:r>
+          </w:p>
+        </w:tc>
+        <w:tc>
+          <w:tcPr/>
+          <w:p>
+            <w:pPr>
+              <w:pStyle w:val="Compact"/>
+              <w:jc w:val="left"/>
+            </w:pPr>
+            <w:r>
+              <w:t xml:space="preserve">—</w:t>
             </w:r>
           </w:p>
         </w:tc>
@@ -5247,7 +5921,7 @@
               <w:jc w:val="left"/>
             </w:pPr>
             <w:r>
-              <w:t xml:space="preserve">any</w:t>
+              <w:t xml:space="preserve">—</w:t>
             </w:r>
           </w:p>
         </w:tc>
@@ -5270,19 +5944,7 @@
         <w:pStyle w:val="BodyText"/>
       </w:pPr>
       <w:r>
-        <w:t xml:space="preserve">Evaluation is a command line entry point, not a route, because it reads ground truth:</w:t>
-      </w:r>
-      <w:r>
-        <w:t xml:space="preserve"> </w:t>
-      </w:r>
-      <w:r>
-        <w:rPr>
-          <w:rStyle w:val="VerbatimChar"/>
-        </w:rPr>
-        <w:t xml:space="preserve">python -m app.cli evaluate --run 1</w:t>
-      </w:r>
-      <w:r>
-        <w:t xml:space="preserve">.</w:t>
+        <w:t xml:space="preserve">Reviewer decisions, adjustments, sign-off and reopening exist only in the interface, never on the command line, so there is one path to each and it goes through the same controls (ADR-31). Evaluation will be a command line entry point, not a route, because it reads ground truth (ADR-11).</w:t>
       </w:r>
     </w:p>
     <w:bookmarkEnd w:id="39"/>
@@ -5331,7 +5993,7 @@
               <w:jc w:val="left"/>
             </w:pPr>
             <w:r>
-              <w:t xml:space="preserve">Code range</w:t>
+              <w:t xml:space="preserve">Raised as</w:t>
             </w:r>
           </w:p>
         </w:tc>
@@ -5357,31 +6019,31 @@
               <w:jc w:val="left"/>
             </w:pPr>
             <w:r>
-              <w:t xml:space="preserve">Input validation</w:t>
-            </w:r>
-          </w:p>
-        </w:tc>
-        <w:tc>
-          <w:tcPr/>
-          <w:p>
-            <w:pPr>
-              <w:pStyle w:val="Compact"/>
-              <w:jc w:val="left"/>
-            </w:pPr>
-            <w:r>
-              <w:t xml:space="preserve">E-VAL-001..099</w:t>
-            </w:r>
-          </w:p>
-        </w:tc>
-        <w:tc>
-          <w:tcPr/>
-          <w:p>
-            <w:pPr>
-              <w:pStyle w:val="Compact"/>
-              <w:jc w:val="left"/>
-            </w:pPr>
-            <w:r>
-              <w:t xml:space="preserve">File structure, fields, types, control totals. Returns to the import screen with every failure listed; the run stays in</w:t>
+              <w:t xml:space="preserve">File validation</w:t>
+            </w:r>
+          </w:p>
+        </w:tc>
+        <w:tc>
+          <w:tcPr/>
+          <w:p>
+            <w:pPr>
+              <w:pStyle w:val="Compact"/>
+              <w:jc w:val="left"/>
+            </w:pPr>
+            <w:r>
+              <w:t xml:space="preserve">VAL-nn results</w:t>
+            </w:r>
+          </w:p>
+        </w:tc>
+        <w:tc>
+          <w:tcPr/>
+          <w:p>
+            <w:pPr>
+              <w:pStyle w:val="Compact"/>
+              <w:jc w:val="left"/>
+            </w:pPr>
+            <w:r>
+              <w:t xml:space="preserve">File-level failures leave the run in</w:t>
             </w:r>
             <w:r>
               <w:t xml:space="preserve"> </w:t>
@@ -5392,6 +6054,101 @@
               </w:rPr>
               <w:t xml:space="preserve">validation_failed</w:t>
             </w:r>
+            <w:r>
+              <w:t xml:space="preserve"> </w:t>
+            </w:r>
+            <w:r>
+              <w:t xml:space="preserve">and block matching (CR-17); row-level failures exclude the row; warnings are kept for review. The correction is a new run (ADR-28)</w:t>
+            </w:r>
+          </w:p>
+        </w:tc>
+      </w:tr>
+      <w:tr>
+        <w:tc>
+          <w:tcPr/>
+          <w:p>
+            <w:pPr>
+              <w:pStyle w:val="Compact"/>
+              <w:jc w:val="left"/>
+            </w:pPr>
+            <w:r>
+              <w:t xml:space="preserve">Input problems</w:t>
+            </w:r>
+          </w:p>
+        </w:tc>
+        <w:tc>
+          <w:tcPr/>
+          <w:p>
+            <w:pPr>
+              <w:pStyle w:val="Compact"/>
+              <w:jc w:val="left"/>
+            </w:pPr>
+            <w:r>
+              <w:rPr>
+                <w:rStyle w:val="VerbatimChar"/>
+              </w:rPr>
+              <w:t xml:space="preserve">AdjustmentInputError</w:t>
+            </w:r>
+            <w:r>
+              <w:t xml:space="preserve">,</w:t>
+            </w:r>
+            <w:r>
+              <w:t xml:space="preserve"> </w:t>
+            </w:r>
+            <w:r>
+              <w:rPr>
+                <w:rStyle w:val="VerbatimChar"/>
+              </w:rPr>
+              <w:t xml:space="preserve">ManualMatchError</w:t>
+            </w:r>
+            <w:r>
+              <w:t xml:space="preserve">,</w:t>
+            </w:r>
+            <w:r>
+              <w:t xml:space="preserve"> </w:t>
+            </w:r>
+            <w:r>
+              <w:rPr>
+                <w:rStyle w:val="VerbatimChar"/>
+              </w:rPr>
+              <w:t xml:space="preserve">PeriodInputError</w:t>
+            </w:r>
+            <w:r>
+              <w:t xml:space="preserve">,</w:t>
+            </w:r>
+            <w:r>
+              <w:t xml:space="preserve"> </w:t>
+            </w:r>
+            <w:r>
+              <w:rPr>
+                <w:rStyle w:val="VerbatimChar"/>
+              </w:rPr>
+              <w:t xml:space="preserve">RunInputError</w:t>
+            </w:r>
+            <w:r>
+              <w:t xml:space="preserve">,</w:t>
+            </w:r>
+            <w:r>
+              <w:t xml:space="preserve"> </w:t>
+            </w:r>
+            <w:r>
+              <w:rPr>
+                <w:rStyle w:val="VerbatimChar"/>
+              </w:rPr>
+              <w:t xml:space="preserve">ImportError_</w:t>
+            </w:r>
+          </w:p>
+        </w:tc>
+        <w:tc>
+          <w:tcPr/>
+          <w:p>
+            <w:pPr>
+              <w:pStyle w:val="Compact"/>
+              <w:jc w:val="left"/>
+            </w:pPr>
+            <w:r>
+              <w:t xml:space="preserve">Every problem listed at once, nothing written, the form is shown again. Not a control, so no BLOCKED_ATTEMPT event</w:t>
+            </w:r>
           </w:p>
         </w:tc>
       </w:tr>
@@ -5416,19 +6173,25 @@
               <w:jc w:val="left"/>
             </w:pPr>
             <w:r>
-              <w:t xml:space="preserve">E-CTL-001..099</w:t>
-            </w:r>
-          </w:p>
-        </w:tc>
-        <w:tc>
-          <w:tcPr/>
-          <w:p>
-            <w:pPr>
-              <w:pStyle w:val="Compact"/>
-              <w:jc w:val="left"/>
-            </w:pPr>
-            <w:r>
-              <w:t xml:space="preserve">Permission, separation of duties, comment rule, period lock. Nothing is written except a BLOCKED_ATTEMPT event; the screen names the blocking rule</w:t>
+              <w:rPr>
+                <w:rStyle w:val="VerbatimChar"/>
+              </w:rPr>
+              <w:t xml:space="preserve">ControlViolation</w:t>
+            </w:r>
+            <w:r>
+              <w:t xml:space="preserve">, E-CTL-001..030</w:t>
+            </w:r>
+          </w:p>
+        </w:tc>
+        <w:tc>
+          <w:tcPr/>
+          <w:p>
+            <w:pPr>
+              <w:pStyle w:val="Compact"/>
+              <w:jc w:val="left"/>
+            </w:pPr>
+            <w:r>
+              <w:t xml:space="preserve">Permission, level, offered action, comment, detail view, separation of duties, batch contents, lock, stage, state transition. Rolled back; a BLOCKED_ATTEMPT event names the rule; the screen shows rule and code</w:t>
             </w:r>
           </w:p>
         </w:tc>
@@ -5454,19 +6217,57 @@
               <w:jc w:val="left"/>
             </w:pPr>
             <w:r>
-              <w:t xml:space="preserve">E-CON-001..099</w:t>
-            </w:r>
-          </w:p>
-        </w:tc>
-        <w:tc>
-          <w:tcPr/>
-          <w:p>
-            <w:pPr>
-              <w:pStyle w:val="Compact"/>
-              <w:jc w:val="left"/>
-            </w:pPr>
-            <w:r>
-              <w:t xml:space="preserve">Item already decided, run already closed, stale form submission. The current state is reloaded and shown</w:t>
+              <w:t xml:space="preserve">E-CTL-030 (STATE)</w:t>
+            </w:r>
+          </w:p>
+        </w:tc>
+        <w:tc>
+          <w:tcPr/>
+          <w:p>
+            <w:pPr>
+              <w:pStyle w:val="Compact"/>
+              <w:jc w:val="left"/>
+            </w:pPr>
+            <w:r>
+              <w:t xml:space="preserve">Already decided, already closed, a record another match proposes, a run at the wrong stage. Handled as a control refusal, so it is also evidenced (revised in Stage 8: one class instead of a separate E-CON range)</w:t>
+            </w:r>
+          </w:p>
+        </w:tc>
+      </w:tr>
+      <w:tr>
+        <w:tc>
+          <w:tcPr/>
+          <w:p>
+            <w:pPr>
+              <w:pStyle w:val="Compact"/>
+              <w:jc w:val="left"/>
+            </w:pPr>
+            <w:r>
+              <w:t xml:space="preserve">Not found</w:t>
+            </w:r>
+          </w:p>
+        </w:tc>
+        <w:tc>
+          <w:tcPr/>
+          <w:p>
+            <w:pPr>
+              <w:pStyle w:val="Compact"/>
+              <w:jc w:val="left"/>
+            </w:pPr>
+            <w:r>
+              <w:t xml:space="preserve">404 page</w:t>
+            </w:r>
+          </w:p>
+        </w:tc>
+        <w:tc>
+          <w:tcPr/>
+          <w:p>
+            <w:pPr>
+              <w:pStyle w:val="Compact"/>
+              <w:jc w:val="left"/>
+            </w:pPr>
+            <w:r>
+              <w:t xml:space="preserve">Unknown run, recommendation, report or queue</w:t>
             </w:r>
           </w:p>
         </w:tc>
@@ -5492,19 +6293,19 @@
               <w:jc w:val="left"/>
             </w:pPr>
             <w:r>
-              <w:t xml:space="preserve">E-SYS-001..099</w:t>
-            </w:r>
-          </w:p>
-        </w:tc>
-        <w:tc>
-          <w:tcPr/>
-          <w:p>
-            <w:pPr>
-              <w:pStyle w:val="Compact"/>
-              <w:jc w:val="left"/>
-            </w:pPr>
-            <w:r>
-              <w:t xml:space="preserve">Database, file system, audit write failure. The transaction rolls back and the user is told the action was not saved</w:t>
+              <w:t xml:space="preserve">Server error</w:t>
+            </w:r>
+          </w:p>
+        </w:tc>
+        <w:tc>
+          <w:tcPr/>
+          <w:p>
+            <w:pPr>
+              <w:pStyle w:val="Compact"/>
+              <w:jc w:val="left"/>
+            </w:pPr>
+            <w:r>
+              <w:t xml:space="preserve">The transaction rolls back and nothing is saved; the stack trace stays in the server console</w:t>
             </w:r>
           </w:p>
         </w:tc>
@@ -5539,7 +6340,7 @@
         <w:pStyle w:val="Compact"/>
       </w:pPr>
       <w:r>
-        <w:t xml:space="preserve">An audit write failure is treated as a system error and rolls back the action (CR-08).</w:t>
+        <w:t xml:space="preserve">An audit write failure rolls back the action that caused it (CR-08).</w:t>
       </w:r>
     </w:p>
     <w:p>
@@ -5551,7 +6352,7 @@
         <w:pStyle w:val="Compact"/>
       </w:pPr>
       <w:r>
-        <w:t xml:space="preserve">Error messages name the rule or test that failed and never blame the user.</w:t>
+        <w:t xml:space="preserve">Messages name the rule or test that failed and never blame the user.</w:t>
       </w:r>
     </w:p>
     <w:p>
@@ -5563,19 +6364,7 @@
         <w:pStyle w:val="Compact"/>
       </w:pPr>
       <w:r>
-        <w:t xml:space="preserve">Stack traces go to the log, never to the screen.</w:t>
-      </w:r>
-    </w:p>
-    <w:p>
-      <w:pPr>
-        <w:numPr>
-          <w:ilvl w:val="0"/>
-          <w:numId w:val="1002"/>
-        </w:numPr>
-        <w:pStyle w:val="Compact"/>
-      </w:pPr>
-      <w:r>
-        <w:t xml:space="preserve">Unhandled exceptions return a generic error page and are logged with a correlation identifier.</w:t>
+        <w:t xml:space="preserve">Stack traces never reach the screen.</w:t>
       </w:r>
     </w:p>
     <w:bookmarkEnd w:id="40"/>
@@ -5657,7 +6446,19 @@
               <w:jc w:val="left"/>
             </w:pPr>
             <w:r>
-              <w:t xml:space="preserve">Selected from a list, stored in a signed session cookie, recorded on every decision. Not authentication, and documented as such</w:t>
+              <w:t xml:space="preserve">Selected from a list, stored in a signed session cookie, recorded on every decision and as IDENTITY_SELECTED. Not authentication, and documented as such. The signing key comes from</w:t>
+            </w:r>
+            <w:r>
+              <w:t xml:space="preserve"> </w:t>
+            </w:r>
+            <w:r>
+              <w:rPr>
+                <w:rStyle w:val="VerbatimChar"/>
+              </w:rPr>
+              <w:t xml:space="preserve">BANKREC_SESSION_KEY</w:t>
+            </w:r>
+            <w:r>
+              <w:t xml:space="preserve">, or is generated per start</w:t>
             </w:r>
           </w:p>
         </w:tc>
@@ -5683,7 +6484,7 @@
               <w:jc w:val="left"/>
             </w:pPr>
             <w:r>
-              <w:t xml:space="preserve">Every state-changing route checks role and control rules server-side. The interface also hides unavailable actions, but hiding is never the control</w:t>
+              <w:t xml:space="preserve">Every state-changing route calls a service, which checks role and control rules. The interface shows unavailable actions disabled with the blocking rule; the screen is guidance, never the control</w:t>
             </w:r>
           </w:p>
         </w:tc>
@@ -5761,7 +6562,19 @@
               <w:jc w:val="left"/>
             </w:pPr>
             <w:r>
-              <w:t xml:space="preserve">A per-session token on every form post</w:t>
+              <w:t xml:space="preserve">The session cookie is</w:t>
+            </w:r>
+            <w:r>
+              <w:t xml:space="preserve"> </w:t>
+            </w:r>
+            <w:r>
+              <w:rPr>
+                <w:rStyle w:val="VerbatimChar"/>
+              </w:rPr>
+              <w:t xml:space="preserve">SameSite=Lax</w:t>
+            </w:r>
+            <w:r>
+              <w:t xml:space="preserve">, so browsers do not send it with a form posted from another site; such a post arrives with no identity and is refused. No separate form token (revised in Stage 8: the application listens on 127.0.0.1 only)</w:t>
             </w:r>
           </w:p>
         </w:tc>
@@ -5787,7 +6600,7 @@
               <w:jc w:val="left"/>
             </w:pPr>
             <w:r>
-              <w:t xml:space="preserve">CSV only, size limit, extension and content sniffing, parsed with the standard CSV reader, never evaluated. Stored under a generated name, so a crafted file name cannot traverse paths</w:t>
+              <w:t xml:space="preserve">Parsed with the standard CSV reader, never evaluated, and validated before anything is matched. Written to a temporary directory under fixed names, so the uploaded file name is never used as a path. No upload size limit: a stated limit of a local prototype</w:t>
             </w:r>
           </w:p>
         </w:tc>
@@ -6367,6 +7180,68 @@
               <w:jc w:val="left"/>
             </w:pPr>
             <w:r>
+              <w:t xml:space="preserve">Pair an exception by hand</w:t>
+            </w:r>
+          </w:p>
+        </w:tc>
+        <w:tc>
+          <w:tcPr/>
+          <w:p>
+            <w:pPr>
+              <w:pStyle w:val="Compact"/>
+              <w:jc w:val="left"/>
+            </w:pPr>
+            <w:r>
+              <w:t xml:space="preserve">by level</w:t>
+            </w:r>
+          </w:p>
+        </w:tc>
+        <w:tc>
+          <w:tcPr/>
+          <w:p>
+            <w:pPr>
+              <w:pStyle w:val="Compact"/>
+              <w:jc w:val="left"/>
+            </w:pPr>
+            <w:r>
+              <w:t xml:space="preserve">by level</w:t>
+            </w:r>
+          </w:p>
+        </w:tc>
+        <w:tc>
+          <w:tcPr/>
+          <w:p>
+            <w:pPr>
+              <w:pStyle w:val="Compact"/>
+              <w:jc w:val="left"/>
+            </w:pPr>
+            <w:r>
+              <w:t xml:space="preserve">senior level only</w:t>
+            </w:r>
+          </w:p>
+        </w:tc>
+        <w:tc>
+          <w:tcPr/>
+          <w:p>
+            <w:pPr>
+              <w:pStyle w:val="Compact"/>
+              <w:jc w:val="left"/>
+            </w:pPr>
+            <w:r>
+              <w:t xml:space="preserve">CR-02, CR-03</w:t>
+            </w:r>
+          </w:p>
+        </w:tc>
+      </w:tr>
+      <w:tr>
+        <w:tc>
+          <w:tcPr/>
+          <w:p>
+            <w:pPr>
+              <w:pStyle w:val="Compact"/>
+              <w:jc w:val="left"/>
+            </w:pPr>
+            <w:r>
               <w:t xml:space="preserve">Propose an adjustment</w:t>
             </w:r>
           </w:p>
@@ -6737,6 +7612,14 @@
       </w:pPr>
       <w:r>
         <w:t xml:space="preserve">Separation-of-duties checks compare user identifiers across records: the escalating user on the item, the preparer on the adjustment, the first-level reviewers in the run, and the requester on the reopen request.</w:t>
+      </w:r>
+    </w:p>
+    <w:p>
+      <w:pPr>
+        <w:pStyle w:val="BodyText"/>
+      </w:pPr>
+      <w:r>
+        <w:t xml:space="preserve">CR-05 and CR-06 cannot be reached through normal use, because the matrix already keeps the Controller out of first-level review and out of reopen requests. Both checks are still enforced and tested directly, as defence in depth.</w:t>
       </w:r>
     </w:p>
     <w:bookmarkEnd w:id="42"/>
@@ -7111,6 +7994,32 @@
             </w:pPr>
             <w:r>
               <w:t xml:space="preserve">The run records elapsed time per stage in the audit log, so the evaluation reports real figures rather than estimates</w:t>
+            </w:r>
+          </w:p>
+        </w:tc>
+      </w:tr>
+      <w:tr>
+        <w:tc>
+          <w:tcPr/>
+          <w:p>
+            <w:pPr>
+              <w:pStyle w:val="Compact"/>
+              <w:jc w:val="left"/>
+            </w:pPr>
+            <w:r>
+              <w:t xml:space="preserve">Measured</w:t>
+            </w:r>
+          </w:p>
+        </w:tc>
+        <w:tc>
+          <w:tcPr/>
+          <w:p>
+            <w:pPr>
+              <w:pStyle w:val="Compact"/>
+              <w:jc w:val="left"/>
+            </w:pPr>
+            <w:r>
+              <w:t xml:space="preserve">Import to routed queues for the August data: about half a second. A 13-report package: about a third of a second. Both on a laptop, well inside NFR-07</w:t>
             </w:r>
           </w:p>
         </w:tc>
@@ -7200,7 +8109,7 @@
               <w:jc w:val="left"/>
             </w:pPr>
             <w:r>
-              <w:t xml:space="preserve">Domain functions with fixed inputs: rules, features, scoring, risk, explanation, calibration</w:t>
+              <w:t xml:space="preserve">Domain and control functions with fixed inputs</w:t>
             </w:r>
           </w:p>
         </w:tc>
@@ -7238,7 +8147,7 @@
               <w:jc w:val="left"/>
             </w:pPr>
             <w:r>
-              <w:t xml:space="preserve">Service plus database: import, validation, matching, decisions, adjustments, close, reopen, reports</w:t>
+              <w:t xml:space="preserve">Service plus database, and the web layer through view functions and HTTP routes</w:t>
             </w:r>
           </w:p>
         </w:tc>
@@ -7276,7 +8185,7 @@
               <w:jc w:val="left"/>
             </w:pPr>
             <w:r>
-              <w:t xml:space="preserve">One test per control rule, asserting both the refusal and the BLOCKED_ATTEMPT event</w:t>
+              <w:t xml:space="preserve">One test per control rule, asserting the refusal, the rule named, and the BLOCKED_ATTEMPT event where one applies</w:t>
             </w:r>
           </w:p>
         </w:tc>
@@ -7314,7 +8223,7 @@
               <w:jc w:val="left"/>
             </w:pPr>
             <w:r>
-              <w:t xml:space="preserve">One test per SCN-01..08 against the labelled dataset</w:t>
+              <w:t xml:space="preserve">SCN-01..08 against the labelled dataset, and the complete August reconciliation</w:t>
             </w:r>
           </w:p>
         </w:tc>
@@ -7352,7 +8261,7 @@
               <w:jc w:val="left"/>
             </w:pPr>
             <w:r>
-              <w:t xml:space="preserve">Same seed yields identical data, recommendations, metrics and report hashes</w:t>
+              <w:t xml:space="preserve">Same seed yields identical data, recommendations and report hashes</w:t>
             </w:r>
           </w:p>
         </w:tc>
@@ -7375,7 +8284,7 @@
         <w:pStyle w:val="BodyText"/>
       </w:pPr>
       <w:r>
-        <w:t xml:space="preserve">Control tests planned: append-only enforcement, decision in a locked period, senior approval required, approver is not the escalator, approver is not the preparer, signer is not the sole reviewer, reopen approver is not the requester, comment required, matching blocked before validation, item not reconciled until all six conditions hold, tampered event detected by chain verification.</w:t>
+        <w:t xml:space="preserve">The test plan, the coverage of every control rule, and the results are in DOC-06.</w:t>
       </w:r>
     </w:p>
     <w:bookmarkEnd w:id="45"/>
@@ -7393,7 +8302,22 @@
         <w:pStyle w:val="FirstParagraph"/>
       </w:pPr>
       <w:r>
-        <w:t xml:space="preserve">Decisions DD-01..DD-12 are recorded in DOC-01 and carried unchanged. DD-01 and DD-02 remain open with the sponsor; the design isolates both so a different ruling changes one module and one screen.</w:t>
+        <w:t xml:space="preserve">Decisions DD-01..DD-12 are recorded in DOC-01 and are all settled as the working design. DD-01 (the false automatic match rate reported as a hypothetical) and DD-02 (one batch action, one record per item) are implemented as described there; both remain isolated, in the evaluation and in</w:t>
+      </w:r>
+      <w:r>
+        <w:t xml:space="preserve"> </w:t>
+      </w:r>
+      <w:r>
+        <w:rPr>
+          <w:rStyle w:val="VerbatimChar"/>
+        </w:rPr>
+        <w:t xml:space="preserve">approve_batch</w:t>
+      </w:r>
+      <w:r>
+        <w:t xml:space="preserve"> </w:t>
+      </w:r>
+      <w:r>
+        <w:t xml:space="preserve">and the W4 screen respectively.</w:t>
       </w:r>
     </w:p>
     <w:tbl>
@@ -8513,6 +9437,610 @@
           </w:p>
         </w:tc>
       </w:tr>
+      <w:tr>
+        <w:tc>
+          <w:tcPr/>
+          <w:p>
+            <w:pPr>
+              <w:pStyle w:val="Compact"/>
+              <w:jc w:val="left"/>
+            </w:pPr>
+            <w:r>
+              <w:t xml:space="preserve">ADR-21</w:t>
+            </w:r>
+          </w:p>
+        </w:tc>
+        <w:tc>
+          <w:tcPr/>
+          <w:p>
+            <w:pPr>
+              <w:pStyle w:val="Compact"/>
+              <w:jc w:val="left"/>
+            </w:pPr>
+            <w:r>
+              <w:t xml:space="preserve">One connection, one request at a time</w:t>
+            </w:r>
+          </w:p>
+        </w:tc>
+        <w:tc>
+          <w:tcPr/>
+          <w:p>
+            <w:pPr>
+              <w:pStyle w:val="Compact"/>
+              <w:jc w:val="left"/>
+            </w:pPr>
+            <w:r>
+              <w:t xml:space="preserve">A local, single-team prototype gains nothing from a pool, and serial handling makes every check-then-write atomic without extra locking</w:t>
+            </w:r>
+          </w:p>
+        </w:tc>
+        <w:tc>
+          <w:tcPr/>
+          <w:p>
+            <w:pPr>
+              <w:pStyle w:val="Compact"/>
+              <w:jc w:val="left"/>
+            </w:pPr>
+            <w:r>
+              <w:t xml:space="preserve">The connection allows use across threads; a slow request delays the next</w:t>
+            </w:r>
+          </w:p>
+        </w:tc>
+      </w:tr>
+      <w:tr>
+        <w:tc>
+          <w:tcPr/>
+          <w:p>
+            <w:pPr>
+              <w:pStyle w:val="Compact"/>
+              <w:jc w:val="left"/>
+            </w:pPr>
+            <w:r>
+              <w:t xml:space="preserve">ADR-22</w:t>
+            </w:r>
+          </w:p>
+        </w:tc>
+        <w:tc>
+          <w:tcPr/>
+          <w:p>
+            <w:pPr>
+              <w:pStyle w:val="Compact"/>
+              <w:jc w:val="left"/>
+            </w:pPr>
+            <w:r>
+              <w:t xml:space="preserve">View functions separate from routes</w:t>
+            </w:r>
+          </w:p>
+        </w:tc>
+        <w:tc>
+          <w:tcPr/>
+          <w:p>
+            <w:pPr>
+              <w:pStyle w:val="Compact"/>
+              <w:jc w:val="left"/>
+            </w:pPr>
+            <w:r>
+              <w:t xml:space="preserve">Every screen can be built and its template rendered in tests without a server</w:t>
+            </w:r>
+          </w:p>
+        </w:tc>
+        <w:tc>
+          <w:tcPr/>
+          <w:p>
+            <w:pPr>
+              <w:pStyle w:val="Compact"/>
+              <w:jc w:val="left"/>
+            </w:pPr>
+            <w:r>
+              <w:t xml:space="preserve">Routes are a few lines each; screen logic lives in</w:t>
+            </w:r>
+            <w:r>
+              <w:t xml:space="preserve"> </w:t>
+            </w:r>
+            <w:r>
+              <w:rPr>
+                <w:rStyle w:val="VerbatimChar"/>
+              </w:rPr>
+              <w:t xml:space="preserve">web/views.py</w:t>
+            </w:r>
+          </w:p>
+        </w:tc>
+      </w:tr>
+      <w:tr>
+        <w:tc>
+          <w:tcPr/>
+          <w:p>
+            <w:pPr>
+              <w:pStyle w:val="Compact"/>
+              <w:jc w:val="left"/>
+            </w:pPr>
+            <w:r>
+              <w:t xml:space="preserve">ADR-23</w:t>
+            </w:r>
+          </w:p>
+        </w:tc>
+        <w:tc>
+          <w:tcPr/>
+          <w:p>
+            <w:pPr>
+              <w:pStyle w:val="Compact"/>
+              <w:jc w:val="left"/>
+            </w:pPr>
+            <w:r>
+              <w:t xml:space="preserve">Manual pairing for exceptions</w:t>
+            </w:r>
+          </w:p>
+        </w:tc>
+        <w:tc>
+          <w:tcPr/>
+          <w:p>
+            <w:pPr>
+              <w:pStyle w:val="Compact"/>
+              <w:jc w:val="left"/>
+            </w:pPr>
+            <w:r>
+              <w:t xml:space="preserve">Where the group search hit its cap, or missed a many-to-one group, reviewers otherwise had no way to correct it; the best achievable difference on the August data was -$77,663.05 against a true -$9,392.35</w:t>
+            </w:r>
+          </w:p>
+        </w:tc>
+        <w:tc>
+          <w:tcPr/>
+          <w:p>
+            <w:pPr>
+              <w:pStyle w:val="Compact"/>
+              <w:jc w:val="left"/>
+            </w:pPr>
+            <w:r>
+              <w:t xml:space="preserve">A reviewer-selected candidate with no score sits beside the system’s candidates, recorded as modify; the arithmetic must agree to the cent</w:t>
+            </w:r>
+          </w:p>
+        </w:tc>
+      </w:tr>
+      <w:tr>
+        <w:tc>
+          <w:tcPr/>
+          <w:p>
+            <w:pPr>
+              <w:pStyle w:val="Compact"/>
+              <w:jc w:val="left"/>
+            </w:pPr>
+            <w:r>
+              <w:t xml:space="preserve">ADR-24</w:t>
+            </w:r>
+          </w:p>
+        </w:tc>
+        <w:tc>
+          <w:tcPr/>
+          <w:p>
+            <w:pPr>
+              <w:pStyle w:val="Compact"/>
+              <w:jc w:val="left"/>
+            </w:pPr>
+            <w:r>
+              <w:t xml:space="preserve">Reject re-proposes as exceptions; modify selects a candidate</w:t>
+            </w:r>
+          </w:p>
+        </w:tc>
+        <w:tc>
+          <w:tcPr/>
+          <w:p>
+            <w:pPr>
+              <w:pStyle w:val="Compact"/>
+              <w:jc w:val="left"/>
+            </w:pPr>
+            <w:r>
+              <w:t xml:space="preserve">One verb per intent:</w:t>
+            </w:r>
+            <w:r>
+              <w:t xml:space="preserve"> </w:t>
+            </w:r>
+            <w:r>
+              <w:t xml:space="preserve">“</w:t>
+            </w:r>
+            <w:r>
+              <w:t xml:space="preserve">this pairing is wrong</w:t>
+            </w:r>
+            <w:r>
+              <w:t xml:space="preserve">”</w:t>
+            </w:r>
+            <w:r>
+              <w:t xml:space="preserve"> </w:t>
+            </w:r>
+            <w:r>
+              <w:t xml:space="preserve">and</w:t>
+            </w:r>
+            <w:r>
+              <w:t xml:space="preserve"> </w:t>
+            </w:r>
+            <w:r>
+              <w:t xml:space="preserve">“</w:t>
+            </w:r>
+            <w:r>
+              <w:t xml:space="preserve">that other pairing is right</w:t>
+            </w:r>
+            <w:r>
+              <w:t xml:space="preserve">”</w:t>
+            </w:r>
+          </w:p>
+        </w:tc>
+        <w:tc>
+          <w:tcPr/>
+          <w:p>
+            <w:pPr>
+              <w:pStyle w:val="Compact"/>
+              <w:jc w:val="left"/>
+            </w:pPr>
+            <w:r>
+              <w:t xml:space="preserve">Re-proposed records are classified by the same rules as matching</w:t>
+            </w:r>
+          </w:p>
+        </w:tc>
+      </w:tr>
+      <w:tr>
+        <w:tc>
+          <w:tcPr/>
+          <w:p>
+            <w:pPr>
+              <w:pStyle w:val="Compact"/>
+              <w:jc w:val="left"/>
+            </w:pPr>
+            <w:r>
+              <w:t xml:space="preserve">ADR-25</w:t>
+            </w:r>
+          </w:p>
+        </w:tc>
+        <w:tc>
+          <w:tcPr/>
+          <w:p>
+            <w:pPr>
+              <w:pStyle w:val="Compact"/>
+              <w:jc w:val="left"/>
+            </w:pPr>
+            <w:r>
+              <w:t xml:space="preserve">Investigate-only exceptions cannot be approved</w:t>
+            </w:r>
+          </w:p>
+        </w:tc>
+        <w:tc>
+          <w:tcPr/>
+          <w:p>
+            <w:pPr>
+              <w:pStyle w:val="Compact"/>
+              <w:jc w:val="left"/>
+            </w:pPr>
+            <w:r>
+              <w:t xml:space="preserve">Approving a duplicate, an unexplained item or a capped search would mark unexplained money reconciled</w:t>
+            </w:r>
+          </w:p>
+        </w:tc>
+        <w:tc>
+          <w:tcPr/>
+          <w:p>
+            <w:pPr>
+              <w:pStyle w:val="Compact"/>
+              <w:jc w:val="left"/>
+            </w:pPr>
+            <w:r>
+              <w:t xml:space="preserve">Those items are paired by hand, escalated, or left unresolved and carried on the statement. Approved timing and bank-originated items count as reconciled</w:t>
+            </w:r>
+          </w:p>
+        </w:tc>
+      </w:tr>
+      <w:tr>
+        <w:tc>
+          <w:tcPr/>
+          <w:p>
+            <w:pPr>
+              <w:pStyle w:val="Compact"/>
+              <w:jc w:val="left"/>
+            </w:pPr>
+            <w:r>
+              <w:t xml:space="preserve">ADR-26</w:t>
+            </w:r>
+          </w:p>
+        </w:tc>
+        <w:tc>
+          <w:tcPr/>
+          <w:p>
+            <w:pPr>
+              <w:pStyle w:val="Compact"/>
+              <w:jc w:val="left"/>
+            </w:pPr>
+            <w:r>
+              <w:t xml:space="preserve">Settling a record settles every other proposal for it</w:t>
+            </w:r>
+          </w:p>
+        </w:tc>
+        <w:tc>
+          <w:tcPr/>
+          <w:p>
+            <w:pPr>
+              <w:pStyle w:val="Compact"/>
+              <w:jc w:val="left"/>
+            </w:pPr>
+            <w:r>
+              <w:t xml:space="preserve">Matching can leave a record both in a match and flagged as a possible duplicate; two approvals must never claim one record</w:t>
+            </w:r>
+          </w:p>
+        </w:tc>
+        <w:tc>
+          <w:tcPr/>
+          <w:p>
+            <w:pPr>
+              <w:pStyle w:val="Compact"/>
+              <w:jc w:val="left"/>
+            </w:pPr>
+            <w:r>
+              <w:t xml:space="preserve">Exceptions for the record are superseded; competing matches refuse the decision; a senior is required when the superseded item needs one</w:t>
+            </w:r>
+          </w:p>
+        </w:tc>
+      </w:tr>
+      <w:tr>
+        <w:tc>
+          <w:tcPr/>
+          <w:p>
+            <w:pPr>
+              <w:pStyle w:val="Compact"/>
+              <w:jc w:val="left"/>
+            </w:pPr>
+            <w:r>
+              <w:t xml:space="preserve">ADR-27</w:t>
+            </w:r>
+          </w:p>
+        </w:tc>
+        <w:tc>
+          <w:tcPr/>
+          <w:p>
+            <w:pPr>
+              <w:pStyle w:val="Compact"/>
+              <w:jc w:val="left"/>
+            </w:pPr>
+            <w:r>
+              <w:t xml:space="preserve">One template for all 13 reports</w:t>
+            </w:r>
+          </w:p>
+        </w:tc>
+        <w:tc>
+          <w:tcPr/>
+          <w:p>
+            <w:pPr>
+              <w:pStyle w:val="Compact"/>
+              <w:jc w:val="left"/>
+            </w:pPr>
+            <w:r>
+              <w:t xml:space="preserve">Consistent layout, and rendering stays out of report logic</w:t>
+            </w:r>
+          </w:p>
+        </w:tc>
+        <w:tc>
+          <w:tcPr/>
+          <w:p>
+            <w:pPr>
+              <w:pStyle w:val="Compact"/>
+              <w:jc w:val="left"/>
+            </w:pPr>
+            <w:r>
+              <w:t xml:space="preserve">Reports are data plus one template; layout changes are made once</w:t>
+            </w:r>
+          </w:p>
+        </w:tc>
+      </w:tr>
+      <w:tr>
+        <w:tc>
+          <w:tcPr/>
+          <w:p>
+            <w:pPr>
+              <w:pStyle w:val="Compact"/>
+              <w:jc w:val="left"/>
+            </w:pPr>
+            <w:r>
+              <w:t xml:space="preserve">ADR-28</w:t>
+            </w:r>
+          </w:p>
+        </w:tc>
+        <w:tc>
+          <w:tcPr/>
+          <w:p>
+            <w:pPr>
+              <w:pStyle w:val="Compact"/>
+              <w:jc w:val="left"/>
+            </w:pPr>
+            <w:r>
+              <w:t xml:space="preserve">Files imported once per run</w:t>
+            </w:r>
+          </w:p>
+        </w:tc>
+        <w:tc>
+          <w:tcPr/>
+          <w:p>
+            <w:pPr>
+              <w:pStyle w:val="Compact"/>
+              <w:jc w:val="left"/>
+            </w:pPr>
+            <w:r>
+              <w:t xml:space="preserve">A second import into a failed run would hold two copies of a statement</w:t>
+            </w:r>
+          </w:p>
+        </w:tc>
+        <w:tc>
+          <w:tcPr/>
+          <w:p>
+            <w:pPr>
+              <w:pStyle w:val="Compact"/>
+              <w:jc w:val="left"/>
+            </w:pPr>
+            <w:r>
+              <w:t xml:space="preserve">A failed run stays as evidence; the correction is a new run</w:t>
+            </w:r>
+          </w:p>
+        </w:tc>
+      </w:tr>
+      <w:tr>
+        <w:tc>
+          <w:tcPr/>
+          <w:p>
+            <w:pPr>
+              <w:pStyle w:val="Compact"/>
+              <w:jc w:val="left"/>
+            </w:pPr>
+            <w:r>
+              <w:t xml:space="preserve">ADR-29</w:t>
+            </w:r>
+          </w:p>
+        </w:tc>
+        <w:tc>
+          <w:tcPr/>
+          <w:p>
+            <w:pPr>
+              <w:pStyle w:val="Compact"/>
+              <w:jc w:val="left"/>
+            </w:pPr>
+            <w:r>
+              <w:t xml:space="preserve">Repositories in one module</w:t>
+            </w:r>
+          </w:p>
+        </w:tc>
+        <w:tc>
+          <w:tcPr/>
+          <w:p>
+            <w:pPr>
+              <w:pStyle w:val="Compact"/>
+              <w:jc w:val="left"/>
+            </w:pPr>
+            <w:r>
+              <w:t xml:space="preserve">Splitting into a package would change every import for no functional gain</w:t>
+            </w:r>
+          </w:p>
+        </w:tc>
+        <w:tc>
+          <w:tcPr/>
+          <w:p>
+            <w:pPr>
+              <w:pStyle w:val="Compact"/>
+              <w:jc w:val="left"/>
+            </w:pPr>
+            <w:r>
+              <w:t xml:space="preserve">Section 2.1 revised; one class per aggregate</w:t>
+            </w:r>
+          </w:p>
+        </w:tc>
+      </w:tr>
+      <w:tr>
+        <w:tc>
+          <w:tcPr/>
+          <w:p>
+            <w:pPr>
+              <w:pStyle w:val="Compact"/>
+              <w:jc w:val="left"/>
+            </w:pPr>
+            <w:r>
+              <w:t xml:space="preserve">ADR-30</w:t>
+            </w:r>
+          </w:p>
+        </w:tc>
+        <w:tc>
+          <w:tcPr/>
+          <w:p>
+            <w:pPr>
+              <w:pStyle w:val="Compact"/>
+              <w:jc w:val="left"/>
+            </w:pPr>
+            <w:r>
+              <w:t xml:space="preserve">Adjustment decisions locked by the service only</w:t>
+            </w:r>
+          </w:p>
+        </w:tc>
+        <w:tc>
+          <w:tcPr/>
+          <w:p>
+            <w:pPr>
+              <w:pStyle w:val="Compact"/>
+              <w:jc w:val="left"/>
+            </w:pPr>
+            <w:r>
+              <w:t xml:space="preserve">The</w:t>
+            </w:r>
+            <w:r>
+              <w:t xml:space="preserve"> </w:t>
+            </w:r>
+            <w:r>
+              <w:rPr>
+                <w:rStyle w:val="VerbatimChar"/>
+              </w:rPr>
+              <w:t xml:space="preserve">adjustment_decision</w:t>
+            </w:r>
+            <w:r>
+              <w:t xml:space="preserve"> </w:t>
+            </w:r>
+            <w:r>
+              <w:t xml:space="preserve">table has no run column, so no trigger can see the period</w:t>
+            </w:r>
+          </w:p>
+        </w:tc>
+        <w:tc>
+          <w:tcPr/>
+          <w:p>
+            <w:pPr>
+              <w:pStyle w:val="Compact"/>
+              <w:jc w:val="left"/>
+            </w:pPr>
+            <w:r>
+              <w:t xml:space="preserve">The service check is the only lock for that table; tested directly and stated as a limit</w:t>
+            </w:r>
+          </w:p>
+        </w:tc>
+      </w:tr>
+      <w:tr>
+        <w:tc>
+          <w:tcPr/>
+          <w:p>
+            <w:pPr>
+              <w:pStyle w:val="Compact"/>
+              <w:jc w:val="left"/>
+            </w:pPr>
+            <w:r>
+              <w:t xml:space="preserve">ADR-31</w:t>
+            </w:r>
+          </w:p>
+        </w:tc>
+        <w:tc>
+          <w:tcPr/>
+          <w:p>
+            <w:pPr>
+              <w:pStyle w:val="Compact"/>
+              <w:jc w:val="left"/>
+            </w:pPr>
+            <w:r>
+              <w:t xml:space="preserve">Decisions only through the interface</w:t>
+            </w:r>
+          </w:p>
+        </w:tc>
+        <w:tc>
+          <w:tcPr/>
+          <w:p>
+            <w:pPr>
+              <w:pStyle w:val="Compact"/>
+              <w:jc w:val="left"/>
+            </w:pPr>
+            <w:r>
+              <w:t xml:space="preserve">A command line shortcut would be a second, weaker path to the same actions</w:t>
+            </w:r>
+          </w:p>
+        </w:tc>
+        <w:tc>
+          <w:tcPr/>
+          <w:p>
+            <w:pPr>
+              <w:pStyle w:val="Compact"/>
+              <w:jc w:val="left"/>
+            </w:pPr>
+            <w:r>
+              <w:t xml:space="preserve">The command line covers setup, the automated pipeline and evidence</w:t>
+            </w:r>
+          </w:p>
+        </w:tc>
+      </w:tr>
     </w:tbl>
     <w:bookmarkEnd w:id="46"/>
     <w:bookmarkStart w:id="47" w:name="traceability"/>
@@ -8600,7 +10128,19 @@
               <w:rPr>
                 <w:rStyle w:val="VerbatimChar"/>
               </w:rPr>
-              <w:t xml:space="preserve">infra/repositories</w:t>
+              <w:t xml:space="preserve">services/run_service.py</w:t>
+            </w:r>
+            <w:r>
+              <w:t xml:space="preserve">,</w:t>
+            </w:r>
+            <w:r>
+              <w:t xml:space="preserve"> </w:t>
+            </w:r>
+            <w:r>
+              <w:rPr>
+                <w:rStyle w:val="VerbatimChar"/>
+              </w:rPr>
+              <w:t xml:space="preserve">web/routes/runs.py</w:t>
             </w:r>
           </w:p>
         </w:tc>
@@ -8817,7 +10357,19 @@
               <w:rPr>
                 <w:rStyle w:val="VerbatimChar"/>
               </w:rPr>
-              <w:t xml:space="preserve">web/routes_review.py</w:t>
+              <w:t xml:space="preserve">web/routes/review.py</w:t>
+            </w:r>
+            <w:r>
+              <w:t xml:space="preserve">,</w:t>
+            </w:r>
+            <w:r>
+              <w:t xml:space="preserve"> </w:t>
+            </w:r>
+            <w:r>
+              <w:rPr>
+                <w:rStyle w:val="VerbatimChar"/>
+              </w:rPr>
+              <w:t xml:space="preserve">web/views.py</w:t>
             </w:r>
             <w:r>
               <w:t xml:space="preserve">,</w:t>
@@ -8943,6 +10495,30 @@
               <w:rPr>
                 <w:rStyle w:val="VerbatimChar"/>
               </w:rPr>
+              <w:t xml:space="preserve">domain/statement.py</w:t>
+            </w:r>
+            <w:r>
+              <w:t xml:space="preserve">,</w:t>
+            </w:r>
+            <w:r>
+              <w:t xml:space="preserve"> </w:t>
+            </w:r>
+            <w:r>
+              <w:rPr>
+                <w:rStyle w:val="VerbatimChar"/>
+              </w:rPr>
+              <w:t xml:space="preserve">web/routes/period.py</w:t>
+            </w:r>
+            <w:r>
+              <w:t xml:space="preserve">,</w:t>
+            </w:r>
+            <w:r>
+              <w:t xml:space="preserve"> </w:t>
+            </w:r>
+            <w:r>
+              <w:rPr>
+                <w:rStyle w:val="VerbatimChar"/>
+              </w:rPr>
               <w:t xml:space="preserve">control/period_lock.py</w:t>
             </w:r>
           </w:p>
@@ -8984,6 +10560,18 @@
               <w:rPr>
                 <w:rStyle w:val="VerbatimChar"/>
               </w:rPr>
+              <w:t xml:space="preserve">services/report_builders.py</w:t>
+            </w:r>
+            <w:r>
+              <w:t xml:space="preserve">,</w:t>
+            </w:r>
+            <w:r>
+              <w:t xml:space="preserve"> </w:t>
+            </w:r>
+            <w:r>
+              <w:rPr>
+                <w:rStyle w:val="VerbatimChar"/>
+              </w:rPr>
               <w:t xml:space="preserve">infra/reports/</w:t>
             </w:r>
             <w:r>
@@ -9022,22 +10610,7 @@
               <w:jc w:val="left"/>
             </w:pPr>
             <w:r>
-              <w:rPr>
-                <w:rStyle w:val="VerbatimChar"/>
-              </w:rPr>
-              <w:t xml:space="preserve">services/evaluation_service.py</w:t>
-            </w:r>
-            <w:r>
-              <w:t xml:space="preserve">,</w:t>
-            </w:r>
-            <w:r>
-              <w:t xml:space="preserve"> </w:t>
-            </w:r>
-            <w:r>
-              <w:rPr>
-                <w:rStyle w:val="VerbatimChar"/>
-              </w:rPr>
-              <w:t xml:space="preserve">cli.py</w:t>
+              <w:t xml:space="preserve">Evaluation command (evaluation stage)</w:t>
             </w:r>
           </w:p>
         </w:tc>
@@ -9931,7 +11504,7 @@
       <w:color w:themeColor="accent1" w:themeShade="BF" w:val="365F91"/>
     </w:rPr>
   </w:style>
-  <w:style w:type="paragraph" w:customStyle="1" w:styleId="SourceCode">
+  <w:style w:customStyle="1" w:styleId="SourceCode" w:type="paragraph">
     <w:name w:val="Source Code"/>
     <w:basedOn w:val="Normal"/>
     <w:link w:val="VerbatimChar"/>
@@ -9939,7 +11512,7 @@
       <w:wordWrap w:val="off"/>
     </w:pPr>
   </w:style>
-  <w:style w:type="character" w:customStyle="1" w:styleId="KeywordTok">
+  <w:style w:customStyle="1" w:styleId="KeywordTok" w:type="character">
     <w:name w:val="KeywordTok"/>
     <w:basedOn w:val="VerbatimChar"/>
     <w:rPr>
@@ -9947,77 +11520,77 @@
       <w:b/>
     </w:rPr>
   </w:style>
-  <w:style w:type="character" w:customStyle="1" w:styleId="DataTypeTok">
+  <w:style w:customStyle="1" w:styleId="DataTypeTok" w:type="character">
     <w:name w:val="DataTypeTok"/>
     <w:basedOn w:val="VerbatimChar"/>
     <w:rPr>
       <w:color w:val="902000"/>
     </w:rPr>
   </w:style>
-  <w:style w:type="character" w:customStyle="1" w:styleId="DecValTok">
+  <w:style w:customStyle="1" w:styleId="DecValTok" w:type="character">
     <w:name w:val="DecValTok"/>
     <w:basedOn w:val="VerbatimChar"/>
     <w:rPr>
       <w:color w:val="40a070"/>
     </w:rPr>
   </w:style>
-  <w:style w:type="character" w:customStyle="1" w:styleId="BaseNTok">
+  <w:style w:customStyle="1" w:styleId="BaseNTok" w:type="character">
     <w:name w:val="BaseNTok"/>
     <w:basedOn w:val="VerbatimChar"/>
     <w:rPr>
       <w:color w:val="40a070"/>
     </w:rPr>
   </w:style>
-  <w:style w:type="character" w:customStyle="1" w:styleId="FloatTok">
+  <w:style w:customStyle="1" w:styleId="FloatTok" w:type="character">
     <w:name w:val="FloatTok"/>
     <w:basedOn w:val="VerbatimChar"/>
     <w:rPr>
       <w:color w:val="40a070"/>
     </w:rPr>
   </w:style>
-  <w:style w:type="character" w:customStyle="1" w:styleId="ConstantTok">
+  <w:style w:customStyle="1" w:styleId="ConstantTok" w:type="character">
     <w:name w:val="ConstantTok"/>
     <w:basedOn w:val="VerbatimChar"/>
     <w:rPr>
       <w:color w:val="880000"/>
     </w:rPr>
   </w:style>
-  <w:style w:type="character" w:customStyle="1" w:styleId="CharTok">
+  <w:style w:customStyle="1" w:styleId="CharTok" w:type="character">
     <w:name w:val="CharTok"/>
     <w:basedOn w:val="VerbatimChar"/>
     <w:rPr>
       <w:color w:val="4070a0"/>
     </w:rPr>
   </w:style>
-  <w:style w:type="character" w:customStyle="1" w:styleId="SpecialCharTok">
+  <w:style w:customStyle="1" w:styleId="SpecialCharTok" w:type="character">
     <w:name w:val="SpecialCharTok"/>
     <w:basedOn w:val="VerbatimChar"/>
     <w:rPr>
       <w:color w:val="4070a0"/>
     </w:rPr>
   </w:style>
-  <w:style w:type="character" w:customStyle="1" w:styleId="StringTok">
+  <w:style w:customStyle="1" w:styleId="StringTok" w:type="character">
     <w:name w:val="StringTok"/>
     <w:basedOn w:val="VerbatimChar"/>
     <w:rPr>
       <w:color w:val="4070a0"/>
     </w:rPr>
   </w:style>
-  <w:style w:type="character" w:customStyle="1" w:styleId="VerbatimStringTok">
+  <w:style w:customStyle="1" w:styleId="VerbatimStringTok" w:type="character">
     <w:name w:val="VerbatimStringTok"/>
     <w:basedOn w:val="VerbatimChar"/>
     <w:rPr>
       <w:color w:val="4070a0"/>
     </w:rPr>
   </w:style>
-  <w:style w:type="character" w:customStyle="1" w:styleId="SpecialStringTok">
+  <w:style w:customStyle="1" w:styleId="SpecialStringTok" w:type="character">
     <w:name w:val="SpecialStringTok"/>
     <w:basedOn w:val="VerbatimChar"/>
     <w:rPr>
       <w:color w:val="bb6688"/>
     </w:rPr>
   </w:style>
-  <w:style w:type="character" w:customStyle="1" w:styleId="ImportTok">
+  <w:style w:customStyle="1" w:styleId="ImportTok" w:type="character">
     <w:name w:val="ImportTok"/>
     <w:basedOn w:val="VerbatimChar"/>
     <w:rPr>
@@ -10025,7 +11598,7 @@
       <w:b/>
     </w:rPr>
   </w:style>
-  <w:style w:type="character" w:customStyle="1" w:styleId="CommentTok">
+  <w:style w:customStyle="1" w:styleId="CommentTok" w:type="character">
     <w:name w:val="CommentTok"/>
     <w:basedOn w:val="VerbatimChar"/>
     <w:rPr>
@@ -10033,7 +11606,7 @@
       <w:i/>
     </w:rPr>
   </w:style>
-  <w:style w:type="character" w:customStyle="1" w:styleId="DocumentationTok">
+  <w:style w:customStyle="1" w:styleId="DocumentationTok" w:type="character">
     <w:name w:val="DocumentationTok"/>
     <w:basedOn w:val="VerbatimChar"/>
     <w:rPr>
@@ -10041,7 +11614,7 @@
       <w:i/>
     </w:rPr>
   </w:style>
-  <w:style w:type="character" w:customStyle="1" w:styleId="AnnotationTok">
+  <w:style w:customStyle="1" w:styleId="AnnotationTok" w:type="character">
     <w:name w:val="AnnotationTok"/>
     <w:basedOn w:val="VerbatimChar"/>
     <w:rPr>
@@ -10050,7 +11623,7 @@
       <w:i/>
     </w:rPr>
   </w:style>
-  <w:style w:type="character" w:customStyle="1" w:styleId="CommentVarTok">
+  <w:style w:customStyle="1" w:styleId="CommentVarTok" w:type="character">
     <w:name w:val="CommentVarTok"/>
     <w:basedOn w:val="VerbatimChar"/>
     <w:rPr>
@@ -10059,28 +11632,28 @@
       <w:i/>
     </w:rPr>
   </w:style>
-  <w:style w:type="character" w:customStyle="1" w:styleId="OtherTok">
+  <w:style w:customStyle="1" w:styleId="OtherTok" w:type="character">
     <w:name w:val="OtherTok"/>
     <w:basedOn w:val="VerbatimChar"/>
     <w:rPr>
       <w:color w:val="007020"/>
     </w:rPr>
   </w:style>
-  <w:style w:type="character" w:customStyle="1" w:styleId="FunctionTok">
+  <w:style w:customStyle="1" w:styleId="FunctionTok" w:type="character">
     <w:name w:val="FunctionTok"/>
     <w:basedOn w:val="VerbatimChar"/>
     <w:rPr>
       <w:color w:val="06287e"/>
     </w:rPr>
   </w:style>
-  <w:style w:type="character" w:customStyle="1" w:styleId="VariableTok">
+  <w:style w:customStyle="1" w:styleId="VariableTok" w:type="character">
     <w:name w:val="VariableTok"/>
     <w:basedOn w:val="VerbatimChar"/>
     <w:rPr>
       <w:color w:val="19177c"/>
     </w:rPr>
   </w:style>
-  <w:style w:type="character" w:customStyle="1" w:styleId="ControlFlowTok">
+  <w:style w:customStyle="1" w:styleId="ControlFlowTok" w:type="character">
     <w:name w:val="ControlFlowTok"/>
     <w:basedOn w:val="VerbatimChar"/>
     <w:rPr>
@@ -10088,45 +11661,45 @@
       <w:b/>
     </w:rPr>
   </w:style>
-  <w:style w:type="character" w:customStyle="1" w:styleId="OperatorTok">
+  <w:style w:customStyle="1" w:styleId="OperatorTok" w:type="character">
     <w:name w:val="OperatorTok"/>
     <w:basedOn w:val="VerbatimChar"/>
     <w:rPr>
       <w:color w:val="666666"/>
     </w:rPr>
   </w:style>
-  <w:style w:type="character" w:customStyle="1" w:styleId="BuiltInTok">
+  <w:style w:customStyle="1" w:styleId="BuiltInTok" w:type="character">
     <w:name w:val="BuiltInTok"/>
     <w:basedOn w:val="VerbatimChar"/>
     <w:rPr>
       <w:color w:val="008000"/>
     </w:rPr>
   </w:style>
-  <w:style w:type="character" w:customStyle="1" w:styleId="ExtensionTok">
+  <w:style w:customStyle="1" w:styleId="ExtensionTok" w:type="character">
     <w:name w:val="ExtensionTok"/>
     <w:basedOn w:val="VerbatimChar"/>
     <w:rPr/>
   </w:style>
-  <w:style w:type="character" w:customStyle="1" w:styleId="PreprocessorTok">
+  <w:style w:customStyle="1" w:styleId="PreprocessorTok" w:type="character">
     <w:name w:val="PreprocessorTok"/>
     <w:basedOn w:val="VerbatimChar"/>
     <w:rPr>
       <w:color w:val="bc7a00"/>
     </w:rPr>
   </w:style>
-  <w:style w:type="character" w:customStyle="1" w:styleId="AttributeTok">
+  <w:style w:customStyle="1" w:styleId="AttributeTok" w:type="character">
     <w:name w:val="AttributeTok"/>
     <w:basedOn w:val="VerbatimChar"/>
     <w:rPr>
       <w:color w:val="7d9029"/>
     </w:rPr>
   </w:style>
-  <w:style w:type="character" w:customStyle="1" w:styleId="RegionMarkerTok">
+  <w:style w:customStyle="1" w:styleId="RegionMarkerTok" w:type="character">
     <w:name w:val="RegionMarkerTok"/>
     <w:basedOn w:val="VerbatimChar"/>
     <w:rPr/>
   </w:style>
-  <w:style w:type="character" w:customStyle="1" w:styleId="InformationTok">
+  <w:style w:customStyle="1" w:styleId="InformationTok" w:type="character">
     <w:name w:val="InformationTok"/>
     <w:basedOn w:val="VerbatimChar"/>
     <w:rPr>
@@ -10135,7 +11708,7 @@
       <w:i/>
     </w:rPr>
   </w:style>
-  <w:style w:type="character" w:customStyle="1" w:styleId="WarningTok">
+  <w:style w:customStyle="1" w:styleId="WarningTok" w:type="character">
     <w:name w:val="WarningTok"/>
     <w:basedOn w:val="VerbatimChar"/>
     <w:rPr>
@@ -10144,7 +11717,7 @@
       <w:i/>
     </w:rPr>
   </w:style>
-  <w:style w:type="character" w:customStyle="1" w:styleId="AlertTok">
+  <w:style w:customStyle="1" w:styleId="AlertTok" w:type="character">
     <w:name w:val="AlertTok"/>
     <w:basedOn w:val="VerbatimChar"/>
     <w:rPr>
@@ -10152,7 +11725,7 @@
       <w:b/>
     </w:rPr>
   </w:style>
-  <w:style w:type="character" w:customStyle="1" w:styleId="ErrorTok">
+  <w:style w:customStyle="1" w:styleId="ErrorTok" w:type="character">
     <w:name w:val="ErrorTok"/>
     <w:basedOn w:val="VerbatimChar"/>
     <w:rPr>
@@ -10160,7 +11733,7 @@
       <w:b/>
     </w:rPr>
   </w:style>
-  <w:style w:type="character" w:customStyle="1" w:styleId="NormalTok">
+  <w:style w:customStyle="1" w:styleId="NormalTok" w:type="character">
     <w:name w:val="NormalTok"/>
     <w:basedOn w:val="VerbatimChar"/>
     <w:rPr/>

</xml_diff>

<commit_message>
feat(evaluation): add evaluator, evaluation report and corrected calibration benchmark
Evaluator measuring every FR-EVL metric on fresh databases, the only application code that reads ground truth. CLI evaluate and timing sample. DOC-07 Evaluation Report with error analysis, limitations and section 15 answers. Calibration benchmark now assesses the raw score once (ECE 0.1234, not 0.0836). README, DOC-05 and DOC-06 updated. 232 tests passing.
</commit_message>
<xml_diff>
--- a/docs/word-files/05_system_design.docx
+++ b/docs/word-files/05_system_design.docx
@@ -467,7 +467,7 @@
         <w:rPr>
           <w:rStyle w:val="VerbatimChar"/>
         </w:rPr>
-        <w:t xml:space="preserve">├── cli.py                  Command line: init, run, status, verify, report, serve, reset</w:t>
+        <w:t xml:space="preserve">├── cli.py                  Command line: init, run, status, verify, report, serve, evaluate, reset</w:t>
       </w:r>
       <w:r>
         <w:br/>
@@ -648,6 +648,33 @@
           <w:rStyle w:val="VerbatimChar"/>
         </w:rPr>
         <w:t xml:space="preserve">│   ├── report_builders.py      Data for RPT-01..13</w:t>
+      </w:r>
+      <w:r>
+        <w:br/>
+      </w:r>
+      <w:r>
+        <w:rPr>
+          <w:rStyle w:val="VerbatimChar"/>
+        </w:rPr>
+        <w:t xml:space="preserve">│   ├── prose_service.py        Optional labelled prose (CR-13)</w:t>
+      </w:r>
+      <w:r>
+        <w:br/>
+      </w:r>
+      <w:r>
+        <w:rPr>
+          <w:rStyle w:val="VerbatimChar"/>
+        </w:rPr>
+        <w:t xml:space="preserve">│   ├── evaluation_service.py   FR-EVL; the only code that reads ground truth</w:t>
+      </w:r>
+      <w:r>
+        <w:br/>
+      </w:r>
+      <w:r>
+        <w:rPr>
+          <w:rStyle w:val="VerbatimChar"/>
+        </w:rPr>
+        <w:t xml:space="preserve">│   ├── reference_data.py       Identities and chart of accounts</w:t>
       </w:r>
       <w:r>
         <w:br/>
@@ -871,7 +898,7 @@
         <w:pStyle w:val="FirstParagraph"/>
       </w:pPr>
       <w:r>
-        <w:t xml:space="preserve">Revised in Stage 8: the web layer separates view functions from routes so every screen can be built and checked without a server (ADR-22); repositories are one module rather than a package (ADR-29); the evaluation service arrives with the evaluation stage.</w:t>
+        <w:t xml:space="preserve">Revised in Stage 8: the web layer separates view functions from routes so every screen can be built and checked without a server (ADR-22); repositories are one module rather than a package (ADR-29).</w:t>
       </w:r>
     </w:p>
     <w:bookmarkEnd w:id="24"/>
@@ -5944,7 +5971,16 @@
         <w:pStyle w:val="BodyText"/>
       </w:pPr>
       <w:r>
-        <w:t xml:space="preserve">Reviewer decisions, adjustments, sign-off and reopening exist only in the interface, never on the command line, so there is one path to each and it goes through the same controls (ADR-31). Evaluation will be a command line entry point, not a route, because it reads ground truth (ADR-11).</w:t>
+        <w:t xml:space="preserve">Reviewer decisions, adjustments, sign-off and reopening exist only in the interface, never on the command line, so there is one path to each and it goes through the same controls (ADR-31). Evaluation is a command line entry point (</w:t>
+      </w:r>
+      <w:r>
+        <w:rPr>
+          <w:rStyle w:val="VerbatimChar"/>
+        </w:rPr>
+        <w:t xml:space="preserve">evaluate</w:t>
+      </w:r>
+      <w:r>
+        <w:t xml:space="preserve">), not a route, because it reads ground truth (ADR-11).</w:t>
       </w:r>
     </w:p>
     <w:bookmarkEnd w:id="39"/>
@@ -10610,7 +10646,37 @@
               <w:jc w:val="left"/>
             </w:pPr>
             <w:r>
-              <w:t xml:space="preserve">Evaluation command (evaluation stage)</w:t>
+              <w:rPr>
+                <w:rStyle w:val="VerbatimChar"/>
+              </w:rPr>
+              <w:t xml:space="preserve">services/evaluation_service.py</w:t>
+            </w:r>
+            <w:r>
+              <w:t xml:space="preserve">,</w:t>
+            </w:r>
+            <w:r>
+              <w:t xml:space="preserve"> </w:t>
+            </w:r>
+            <w:r>
+              <w:rPr>
+                <w:rStyle w:val="VerbatimChar"/>
+              </w:rPr>
+              <w:t xml:space="preserve">cli.py</w:t>
+            </w:r>
+            <w:r>
+              <w:t xml:space="preserve"> </w:t>
+            </w:r>
+            <w:r>
+              <w:t xml:space="preserve">(</w:t>
+            </w:r>
+            <w:r>
+              <w:rPr>
+                <w:rStyle w:val="VerbatimChar"/>
+              </w:rPr>
+              <w:t xml:space="preserve">evaluate</w:t>
+            </w:r>
+            <w:r>
+              <w:t xml:space="preserve">)</w:t>
             </w:r>
           </w:p>
         </w:tc>

</xml_diff>